<commit_message>
RD: resumen medín — protección de puertos, servicios udp, nmap, predicción de secuencia, ngfw en osi; preguntas tipo 24–27
Co-Authored-By: Claude Opus 5.5 <noreply@anthropic.com>
</commit_message>
<xml_diff>
--- a/materias/RD/estudio/resumen-2do-parcial-medin.docx
+++ b/materias/RD/estudio/resumen-2do-parcial-medin.docx
@@ -9423,7 +9423,7 @@
           <w:szCs w:val="22"/>
           <w:lang w:val="es-AR"/>
         </w:rPr>
-        <w:t xml:space="preserve">). Defensas: limitar las conexiones nuevas y usar </w:t>
+        <w:t xml:space="preserve">). Defensas: limitar las conexiones nuevas (globales o por IP), aceptar solo IP confiables y usar </w:t>
       </w:r>
       <w:r>
         <w:rPr>
@@ -9445,7 +9445,7 @@
           <w:szCs w:val="22"/>
           <w:lang w:val="es-AR"/>
         </w:rPr>
-        <w:t xml:space="preserve">*. Filtrar las IP atacantes sirve poco, porque se pueden falsificar.</w:t>
+        <w:t xml:space="preserve">*, que retrasan la reserva de recursos hasta que el handshake se completa. Filtrar las IP atacantes sirve poco, porque se pueden falsificar.</w:t>
       </w:r>
     </w:p>
     <w:p>
@@ -9468,39 +9468,83 @@
           <w:szCs w:val="22"/>
           <w:lang w:val="es-AR"/>
         </w:rPr>
-        <w:t xml:space="preserve">Spoofing:</w:t>
-      </w:r>
-      <w:r>
-        <w:rPr>
-          <w:rFonts w:ascii="Lexend" w:cs="Lexend" w:eastAsia="Lexend" w:hAnsi="Lexend"/>
-          <w:color w:val="1A1A1A"/>
-          <w:sz w:val="22"/>
-          <w:szCs w:val="22"/>
-          <w:lang w:val="es-AR"/>
-        </w:rPr>
-        <w:t xml:space="preserve"> paquetes con </w:t>
-      </w:r>
-      <w:r>
-        <w:rPr>
-          <w:rFonts w:ascii="Lexend" w:cs="Lexend" w:eastAsia="Lexend" w:hAnsi="Lexend"/>
-          <w:b/>
-          <w:bCs/>
-          <w:color w:val="1A1A1A"/>
-          <w:sz w:val="22"/>
-          <w:szCs w:val="22"/>
-          <w:lang w:val="es-AR"/>
-        </w:rPr>
-        <w:t xml:space="preserve">IP o puerto de origen falsos</w:t>
-      </w:r>
-      <w:r>
-        <w:rPr>
-          <w:rFonts w:ascii="Lexend" w:cs="Lexend" w:eastAsia="Lexend" w:hAnsi="Lexend"/>
-          <w:color w:val="1A1A1A"/>
-          <w:sz w:val="22"/>
-          <w:szCs w:val="22"/>
-          <w:lang w:val="es-AR"/>
-        </w:rPr>
-        <w:t xml:space="preserve">, para esconder al atacante o hacerse pasar por un host de confianza.</w:t>
+        <w:t xml:space="preserve">Predicción de secuencia TCP:</w:t>
+      </w:r>
+      <w:r>
+        <w:rPr>
+          <w:rFonts w:ascii="Lexend" w:cs="Lexend" w:eastAsia="Lexend" w:hAnsi="Lexend"/>
+          <w:color w:val="1A1A1A"/>
+          <w:sz w:val="22"/>
+          <w:szCs w:val="22"/>
+          <w:lang w:val="es-AR"/>
+        </w:rPr>
+        <w:t xml:space="preserve"> el atacante </w:t>
+      </w:r>
+      <w:r>
+        <w:rPr>
+          <w:rFonts w:ascii="Lexend" w:cs="Lexend" w:eastAsia="Lexend" w:hAnsi="Lexend"/>
+          <w:b/>
+          <w:bCs/>
+          <w:color w:val="1A1A1A"/>
+          <w:sz w:val="22"/>
+          <w:szCs w:val="22"/>
+          <w:lang w:val="es-AR"/>
+        </w:rPr>
+        <w:t xml:space="preserve">adivina el número de secuencia</w:t>
+      </w:r>
+      <w:r>
+        <w:rPr>
+          <w:rFonts w:ascii="Lexend" w:cs="Lexend" w:eastAsia="Lexend" w:hAnsi="Lexend"/>
+          <w:color w:val="1A1A1A"/>
+          <w:sz w:val="22"/>
+          <w:szCs w:val="22"/>
+          <w:lang w:val="es-AR"/>
+        </w:rPr>
+        <w:t xml:space="preserve"> que va a usar una conexión y manda paquetes falsificados que el destino acepta como legítimos, </w:t>
+      </w:r>
+      <w:r>
+        <w:rPr>
+          <w:rFonts w:ascii="Lexend" w:cs="Lexend" w:eastAsia="Lexend" w:hAnsi="Lexend"/>
+          <w:b/>
+          <w:bCs/>
+          <w:color w:val="1A1A1A"/>
+          <w:sz w:val="22"/>
+          <w:szCs w:val="22"/>
+          <w:lang w:val="es-AR"/>
+        </w:rPr>
+        <w:t xml:space="preserve">antes de que llegue el paquete del host verdadero</w:t>
+      </w:r>
+      <w:r>
+        <w:rPr>
+          <w:rFonts w:ascii="Lexend" w:cs="Lexend" w:eastAsia="Lexend" w:hAnsi="Lexend"/>
+          <w:color w:val="1A1A1A"/>
+          <w:sz w:val="22"/>
+          <w:szCs w:val="22"/>
+          <w:lang w:val="es-AR"/>
+        </w:rPr>
+        <w:t xml:space="preserve">. Por eso el número de secuencia inicial es </w:t>
+      </w:r>
+      <w:r>
+        <w:rPr>
+          <w:rFonts w:ascii="Lexend" w:cs="Lexend" w:eastAsia="Lexend" w:hAnsi="Lexend"/>
+          <w:b/>
+          <w:bCs/>
+          <w:color w:val="1A1A1A"/>
+          <w:sz w:val="22"/>
+          <w:szCs w:val="22"/>
+          <w:lang w:val="es-AR"/>
+        </w:rPr>
+        <w:t xml:space="preserve">aleatorio</w:t>
+      </w:r>
+      <w:r>
+        <w:rPr>
+          <w:rFonts w:ascii="Lexend" w:cs="Lexend" w:eastAsia="Lexend" w:hAnsi="Lexend"/>
+          <w:color w:val="1A1A1A"/>
+          <w:sz w:val="22"/>
+          <w:szCs w:val="22"/>
+          <w:lang w:val="es-AR"/>
+        </w:rPr>
+        <w:t xml:space="preserve">.</w:t>
       </w:r>
     </w:p>
     <w:p>
@@ -9523,39 +9567,39 @@
           <w:szCs w:val="22"/>
           <w:lang w:val="es-AR"/>
         </w:rPr>
-        <w:t xml:space="preserve">Manipulación de paquetes:</w:t>
-      </w:r>
-      <w:r>
-        <w:rPr>
-          <w:rFonts w:ascii="Lexend" w:cs="Lexend" w:eastAsia="Lexend" w:hAnsi="Lexend"/>
-          <w:color w:val="1A1A1A"/>
-          <w:sz w:val="22"/>
-          <w:szCs w:val="22"/>
-          <w:lang w:val="es-AR"/>
-        </w:rPr>
-        <w:t xml:space="preserve"> interceptar y cambiar los puertos (</w:t>
-      </w:r>
-      <w:r>
-        <w:rPr>
-          <w:rFonts w:ascii="Lexend" w:cs="Lexend" w:eastAsia="Lexend" w:hAnsi="Lexend"/>
-          <w:i/>
-          <w:iCs/>
-          <w:color w:val="1A1A1A"/>
-          <w:sz w:val="22"/>
-          <w:szCs w:val="22"/>
-          <w:lang w:val="es-AR"/>
-        </w:rPr>
-        <w:t xml:space="preserve">man-in-the-middle</w:t>
-      </w:r>
-      <w:r>
-        <w:rPr>
-          <w:rFonts w:ascii="Lexend" w:cs="Lexend" w:eastAsia="Lexend" w:hAnsi="Lexend"/>
-          <w:color w:val="1A1A1A"/>
-          <w:sz w:val="22"/>
-          <w:szCs w:val="22"/>
-          <w:lang w:val="es-AR"/>
-        </w:rPr>
-        <w:t xml:space="preserve">).</w:t>
+        <w:t xml:space="preserve">Spoofing:</w:t>
+      </w:r>
+      <w:r>
+        <w:rPr>
+          <w:rFonts w:ascii="Lexend" w:cs="Lexend" w:eastAsia="Lexend" w:hAnsi="Lexend"/>
+          <w:color w:val="1A1A1A"/>
+          <w:sz w:val="22"/>
+          <w:szCs w:val="22"/>
+          <w:lang w:val="es-AR"/>
+        </w:rPr>
+        <w:t xml:space="preserve"> paquetes con </w:t>
+      </w:r>
+      <w:r>
+        <w:rPr>
+          <w:rFonts w:ascii="Lexend" w:cs="Lexend" w:eastAsia="Lexend" w:hAnsi="Lexend"/>
+          <w:b/>
+          <w:bCs/>
+          <w:color w:val="1A1A1A"/>
+          <w:sz w:val="22"/>
+          <w:szCs w:val="22"/>
+          <w:lang w:val="es-AR"/>
+        </w:rPr>
+        <w:t xml:space="preserve">IP o puerto de origen falsos</w:t>
+      </w:r>
+      <w:r>
+        <w:rPr>
+          <w:rFonts w:ascii="Lexend" w:cs="Lexend" w:eastAsia="Lexend" w:hAnsi="Lexend"/>
+          <w:color w:val="1A1A1A"/>
+          <w:sz w:val="22"/>
+          <w:szCs w:val="22"/>
+          <w:lang w:val="es-AR"/>
+        </w:rPr>
+        <w:t xml:space="preserve">, para esconder al atacante o hacerse pasar por un host de confianza.</w:t>
       </w:r>
     </w:p>
     <w:p>
@@ -9578,6 +9622,61 @@
           <w:szCs w:val="22"/>
           <w:lang w:val="es-AR"/>
         </w:rPr>
+        <w:t xml:space="preserve">Manipulación de paquetes:</w:t>
+      </w:r>
+      <w:r>
+        <w:rPr>
+          <w:rFonts w:ascii="Lexend" w:cs="Lexend" w:eastAsia="Lexend" w:hAnsi="Lexend"/>
+          <w:color w:val="1A1A1A"/>
+          <w:sz w:val="22"/>
+          <w:szCs w:val="22"/>
+          <w:lang w:val="es-AR"/>
+        </w:rPr>
+        <w:t xml:space="preserve"> interceptar y cambiar los puertos (</w:t>
+      </w:r>
+      <w:r>
+        <w:rPr>
+          <w:rFonts w:ascii="Lexend" w:cs="Lexend" w:eastAsia="Lexend" w:hAnsi="Lexend"/>
+          <w:i/>
+          <w:iCs/>
+          <w:color w:val="1A1A1A"/>
+          <w:sz w:val="22"/>
+          <w:szCs w:val="22"/>
+          <w:lang w:val="es-AR"/>
+        </w:rPr>
+        <w:t xml:space="preserve">man-in-the-middle</w:t>
+      </w:r>
+      <w:r>
+        <w:rPr>
+          <w:rFonts w:ascii="Lexend" w:cs="Lexend" w:eastAsia="Lexend" w:hAnsi="Lexend"/>
+          <w:color w:val="1A1A1A"/>
+          <w:sz w:val="22"/>
+          <w:szCs w:val="22"/>
+          <w:lang w:val="es-AR"/>
+        </w:rPr>
+        <w:t xml:space="preserve">).</w:t>
+      </w:r>
+    </w:p>
+    <w:p>
+      <w:pPr>
+        <w:pStyle w:val="ListParagraph"/>
+        <w:numPr>
+          <w:ilvl w:val="0"/>
+          <w:numId w:val="1"/>
+        </w:numPr>
+        <w:spacing w:after="100" w:line="276"/>
+        <w:jc w:val="both"/>
+      </w:pPr>
+      <w:r>
+        <w:rPr>
+          <w:rFonts w:ascii="Lexend" w:cs="Lexend" w:eastAsia="Lexend" w:hAnsi="Lexend"/>
+          <w:b/>
+          <w:bCs/>
+          <w:color w:val="1A1A1A"/>
+          <w:sz w:val="22"/>
+          <w:szCs w:val="22"/>
+          <w:lang w:val="es-AR"/>
+        </w:rPr>
         <w:t xml:space="preserve">Tunneling:</w:t>
       </w:r>
       <w:r>
@@ -9601,6 +9700,944 @@
           <w:lang w:val="es-AR"/>
         </w:rPr>
         <w:t xml:space="preserve">atravesar firewalls</w:t>
+      </w:r>
+      <w:r>
+        <w:rPr>
+          <w:rFonts w:ascii="Lexend" w:cs="Lexend" w:eastAsia="Lexend" w:hAnsi="Lexend"/>
+          <w:color w:val="1A1A1A"/>
+          <w:sz w:val="22"/>
+          <w:szCs w:val="22"/>
+          <w:lang w:val="es-AR"/>
+        </w:rPr>
+        <w:t xml:space="preserve">.</w:t>
+      </w:r>
+    </w:p>
+    <w:p>
+      <w:pPr>
+        <w:pStyle w:val="Heading2"/>
+        <w:keepNext/>
+        <w:spacing w:after="120" w:before="300"/>
+      </w:pPr>
+      <w:r>
+        <w:rPr>
+          <w:rFonts w:ascii="Lexend" w:cs="Lexend" w:eastAsia="Lexend" w:hAnsi="Lexend"/>
+          <w:b/>
+          <w:bCs/>
+          <w:color w:val="1A1A1A"/>
+          <w:spacing w:val="18"/>
+          <w:sz w:val="21"/>
+          <w:szCs w:val="21"/>
+          <w:lang w:val="es-AR"/>
+        </w:rPr>
+        <w:t xml:space="preserve">PELIGROS DE LOS PUERTOS ABIERTOS Y CÓMO PROTEGERLOS</w:t>
+      </w:r>
+    </w:p>
+    <w:p>
+      <w:pPr>
+        <w:spacing w:after="120" w:line="280"/>
+        <w:jc w:val="both"/>
+      </w:pPr>
+      <w:r>
+        <w:rPr>
+          <w:rFonts w:ascii="Lexend" w:cs="Lexend" w:eastAsia="Lexend" w:hAnsi="Lexend"/>
+          <w:color w:val="1A1A1A"/>
+          <w:sz w:val="22"/>
+          <w:szCs w:val="22"/>
+          <w:lang w:val="es-AR"/>
+        </w:rPr>
+        <w:t xml:space="preserve">Un puerto abierto es una puerta hacia el equipo. Los riesgos que marca el apunte:</w:t>
+      </w:r>
+    </w:p>
+    <w:p>
+      <w:pPr>
+        <w:pStyle w:val="ListParagraph"/>
+        <w:numPr>
+          <w:ilvl w:val="0"/>
+          <w:numId w:val="1"/>
+        </w:numPr>
+        <w:spacing w:after="100" w:line="276"/>
+        <w:jc w:val="both"/>
+      </w:pPr>
+      <w:r>
+        <w:rPr>
+          <w:rFonts w:ascii="Lexend" w:cs="Lexend" w:eastAsia="Lexend" w:hAnsi="Lexend"/>
+          <w:b/>
+          <w:bCs/>
+          <w:color w:val="1A1A1A"/>
+          <w:sz w:val="22"/>
+          <w:szCs w:val="22"/>
+          <w:lang w:val="es-AR"/>
+        </w:rPr>
+        <w:t xml:space="preserve">Malware, troyanos y accesos no autorizados:</w:t>
+      </w:r>
+      <w:r>
+        <w:rPr>
+          <w:rFonts w:ascii="Lexend" w:cs="Lexend" w:eastAsia="Lexend" w:hAnsi="Lexend"/>
+          <w:color w:val="1A1A1A"/>
+          <w:sz w:val="22"/>
+          <w:szCs w:val="22"/>
+          <w:lang w:val="es-AR"/>
+        </w:rPr>
+        <w:t xml:space="preserve"> usan el puerto abierto para entrar y correr servicios no autorizados.</w:t>
+      </w:r>
+    </w:p>
+    <w:p>
+      <w:pPr>
+        <w:pStyle w:val="ListParagraph"/>
+        <w:numPr>
+          <w:ilvl w:val="0"/>
+          <w:numId w:val="1"/>
+        </w:numPr>
+        <w:spacing w:after="100" w:line="276"/>
+        <w:jc w:val="both"/>
+      </w:pPr>
+      <w:r>
+        <w:rPr>
+          <w:rFonts w:ascii="Lexend" w:cs="Lexend" w:eastAsia="Lexend" w:hAnsi="Lexend"/>
+          <w:b/>
+          <w:bCs/>
+          <w:color w:val="1A1A1A"/>
+          <w:sz w:val="22"/>
+          <w:szCs w:val="22"/>
+          <w:lang w:val="es-AR"/>
+        </w:rPr>
+        <w:t xml:space="preserve">Exposición de vulnerabilidades:</w:t>
+      </w:r>
+      <w:r>
+        <w:rPr>
+          <w:rFonts w:ascii="Lexend" w:cs="Lexend" w:eastAsia="Lexend" w:hAnsi="Lexend"/>
+          <w:color w:val="1A1A1A"/>
+          <w:sz w:val="22"/>
+          <w:szCs w:val="22"/>
+          <w:lang w:val="es-AR"/>
+        </w:rPr>
+        <w:t xml:space="preserve"> el atacante </w:t>
+      </w:r>
+      <w:r>
+        <w:rPr>
+          <w:rFonts w:ascii="Lexend" w:cs="Lexend" w:eastAsia="Lexend" w:hAnsi="Lexend"/>
+          <w:b/>
+          <w:bCs/>
+          <w:color w:val="1A1A1A"/>
+          <w:sz w:val="22"/>
+          <w:szCs w:val="22"/>
+          <w:lang w:val="es-AR"/>
+        </w:rPr>
+        <w:t xml:space="preserve">escanea</w:t>
+      </w:r>
+      <w:r>
+        <w:rPr>
+          <w:rFonts w:ascii="Lexend" w:cs="Lexend" w:eastAsia="Lexend" w:hAnsi="Lexend"/>
+          <w:color w:val="1A1A1A"/>
+          <w:sz w:val="22"/>
+          <w:szCs w:val="22"/>
+          <w:lang w:val="es-AR"/>
+        </w:rPr>
+        <w:t xml:space="preserve"> los puertos, consulta los servicios que escuchan y averigua versiones para atacar después.</w:t>
+      </w:r>
+    </w:p>
+    <w:p>
+      <w:pPr>
+        <w:pStyle w:val="ListParagraph"/>
+        <w:numPr>
+          <w:ilvl w:val="0"/>
+          <w:numId w:val="1"/>
+        </w:numPr>
+        <w:spacing w:after="100" w:line="276"/>
+        <w:jc w:val="both"/>
+      </w:pPr>
+      <w:r>
+        <w:rPr>
+          <w:rFonts w:ascii="Lexend" w:cs="Lexend" w:eastAsia="Lexend" w:hAnsi="Lexend"/>
+          <w:b/>
+          <w:bCs/>
+          <w:color w:val="1A1A1A"/>
+          <w:sz w:val="22"/>
+          <w:szCs w:val="22"/>
+          <w:lang w:val="es-AR"/>
+        </w:rPr>
+        <w:t xml:space="preserve">DoS / DDoS:</w:t>
+      </w:r>
+      <w:r>
+        <w:rPr>
+          <w:rFonts w:ascii="Lexend" w:cs="Lexend" w:eastAsia="Lexend" w:hAnsi="Lexend"/>
+          <w:color w:val="1A1A1A"/>
+          <w:sz w:val="22"/>
+          <w:szCs w:val="22"/>
+          <w:lang w:val="es-AR"/>
+        </w:rPr>
+        <w:t xml:space="preserve"> saturan el servicio expuesto hasta que deja de responder.</w:t>
+      </w:r>
+    </w:p>
+    <w:p>
+      <w:pPr>
+        <w:spacing w:after="120" w:line="280"/>
+        <w:jc w:val="both"/>
+      </w:pPr>
+      <w:r>
+        <w:rPr>
+          <w:rFonts w:ascii="Lexend" w:cs="Lexend" w:eastAsia="Lexend" w:hAnsi="Lexend"/>
+          <w:color w:val="1A1A1A"/>
+          <w:sz w:val="22"/>
+          <w:szCs w:val="22"/>
+          <w:lang w:val="es-AR"/>
+        </w:rPr>
+        <w:t xml:space="preserve">Los </w:t>
+      </w:r>
+      <w:r>
+        <w:rPr>
+          <w:rFonts w:ascii="Lexend" w:cs="Lexend" w:eastAsia="Lexend" w:hAnsi="Lexend"/>
+          <w:b/>
+          <w:bCs/>
+          <w:color w:val="1A1A1A"/>
+          <w:sz w:val="22"/>
+          <w:szCs w:val="22"/>
+          <w:lang w:val="es-AR"/>
+        </w:rPr>
+        <w:t xml:space="preserve">más atacados</w:t>
+      </w:r>
+      <w:r>
+        <w:rPr>
+          <w:rFonts w:ascii="Lexend" w:cs="Lexend" w:eastAsia="Lexend" w:hAnsi="Lexend"/>
+          <w:color w:val="1A1A1A"/>
+          <w:sz w:val="22"/>
+          <w:szCs w:val="22"/>
+          <w:lang w:val="es-AR"/>
+        </w:rPr>
+        <w:t xml:space="preserve"> son los de los servicios más usados: </w:t>
+      </w:r>
+      <w:r>
+        <w:rPr>
+          <w:rFonts w:ascii="Lexend" w:cs="Lexend" w:eastAsia="Lexend" w:hAnsi="Lexend"/>
+          <w:b/>
+          <w:bCs/>
+          <w:color w:val="1A1A1A"/>
+          <w:sz w:val="22"/>
+          <w:szCs w:val="22"/>
+          <w:lang w:val="es-AR"/>
+        </w:rPr>
+        <w:t xml:space="preserve">FTP 21, SSH 22, Telnet 23, SMTP 25, HTTP 80, HTTPS 443 y POP3 110</w:t>
+      </w:r>
+      <w:r>
+        <w:rPr>
+          <w:rFonts w:ascii="Lexend" w:cs="Lexend" w:eastAsia="Lexend" w:hAnsi="Lexend"/>
+          <w:color w:val="1A1A1A"/>
+          <w:sz w:val="22"/>
+          <w:szCs w:val="22"/>
+          <w:lang w:val="es-AR"/>
+        </w:rPr>
+        <w:t xml:space="preserve">.</w:t>
+      </w:r>
+    </w:p>
+    <w:p>
+      <w:pPr>
+        <w:spacing w:after="260" w:line="288"/>
+        <w:jc w:val="center"/>
+      </w:pPr>
+      <w:r>
+        <w:rPr>
+          <w:rFonts w:ascii="Lexend" w:cs="Lexend" w:eastAsia="Lexend" w:hAnsi="Lexend"/>
+          <w:b/>
+          <w:bCs/>
+          <w:color w:val="1A1A1A"/>
+          <w:sz w:val="22"/>
+          <w:szCs w:val="22"/>
+          <w:lang w:val="es-AR"/>
+        </w:rPr>
+        <w:t xml:space="preserve">Cómo protegerlos:</w:t>
+      </w:r>
+    </w:p>
+    <w:p>
+      <w:pPr>
+        <w:pStyle w:val="ListParagraph"/>
+        <w:numPr>
+          <w:ilvl w:val="0"/>
+          <w:numId w:val="1"/>
+        </w:numPr>
+        <w:spacing w:after="100" w:line="276"/>
+        <w:jc w:val="both"/>
+      </w:pPr>
+      <w:r>
+        <w:rPr>
+          <w:rFonts w:ascii="Lexend" w:cs="Lexend" w:eastAsia="Lexend" w:hAnsi="Lexend"/>
+          <w:b/>
+          <w:bCs/>
+          <w:color w:val="1A1A1A"/>
+          <w:sz w:val="22"/>
+          <w:szCs w:val="22"/>
+          <w:lang w:val="es-AR"/>
+        </w:rPr>
+        <w:t xml:space="preserve">Todos cerrados por defecto</w:t>
+      </w:r>
+      <w:r>
+        <w:rPr>
+          <w:rFonts w:ascii="Lexend" w:cs="Lexend" w:eastAsia="Lexend" w:hAnsi="Lexend"/>
+          <w:color w:val="1A1A1A"/>
+          <w:sz w:val="22"/>
+          <w:szCs w:val="22"/>
+          <w:lang w:val="es-AR"/>
+        </w:rPr>
+        <w:t xml:space="preserve"> y abrir solo los que un servicio necesita: menos servicios expuestos es </w:t>
+      </w:r>
+      <w:r>
+        <w:rPr>
+          <w:rFonts w:ascii="Lexend" w:cs="Lexend" w:eastAsia="Lexend" w:hAnsi="Lexend"/>
+          <w:b/>
+          <w:bCs/>
+          <w:color w:val="1A1A1A"/>
+          <w:sz w:val="22"/>
+          <w:szCs w:val="22"/>
+          <w:lang w:val="es-AR"/>
+        </w:rPr>
+        <w:t xml:space="preserve">menos superficie de ataque</w:t>
+      </w:r>
+      <w:r>
+        <w:rPr>
+          <w:rFonts w:ascii="Lexend" w:cs="Lexend" w:eastAsia="Lexend" w:hAnsi="Lexend"/>
+          <w:color w:val="1A1A1A"/>
+          <w:sz w:val="22"/>
+          <w:szCs w:val="22"/>
+          <w:lang w:val="es-AR"/>
+        </w:rPr>
+        <w:t xml:space="preserve">. El firewall cierra todo y abre solo lo pedido.</w:t>
+      </w:r>
+    </w:p>
+    <w:p>
+      <w:pPr>
+        <w:pStyle w:val="ListParagraph"/>
+        <w:numPr>
+          <w:ilvl w:val="0"/>
+          <w:numId w:val="1"/>
+        </w:numPr>
+        <w:spacing w:after="100" w:line="276"/>
+        <w:jc w:val="both"/>
+      </w:pPr>
+      <w:r>
+        <w:rPr>
+          <w:rFonts w:ascii="Lexend" w:cs="Lexend" w:eastAsia="Lexend" w:hAnsi="Lexend"/>
+          <w:b/>
+          <w:bCs/>
+          <w:color w:val="1A1A1A"/>
+          <w:sz w:val="22"/>
+          <w:szCs w:val="22"/>
+          <w:lang w:val="es-AR"/>
+        </w:rPr>
+        <w:t xml:space="preserve">Software actualizado:</w:t>
+      </w:r>
+      <w:r>
+        <w:rPr>
+          <w:rFonts w:ascii="Lexend" w:cs="Lexend" w:eastAsia="Lexend" w:hAnsi="Lexend"/>
+          <w:color w:val="1A1A1A"/>
+          <w:sz w:val="22"/>
+          <w:szCs w:val="22"/>
+          <w:lang w:val="es-AR"/>
+        </w:rPr>
+        <w:t xml:space="preserve"> de nada sirve cerrar todo menos un puerto si el servicio que escucha ahí tiene fallas.</w:t>
+      </w:r>
+    </w:p>
+    <w:p>
+      <w:pPr>
+        <w:pStyle w:val="ListParagraph"/>
+        <w:numPr>
+          <w:ilvl w:val="0"/>
+          <w:numId w:val="1"/>
+        </w:numPr>
+        <w:spacing w:after="100" w:line="276"/>
+        <w:jc w:val="both"/>
+      </w:pPr>
+      <w:r>
+        <w:rPr>
+          <w:rFonts w:ascii="Lexend" w:cs="Lexend" w:eastAsia="Lexend" w:hAnsi="Lexend"/>
+          <w:b/>
+          <w:bCs/>
+          <w:color w:val="1A1A1A"/>
+          <w:sz w:val="22"/>
+          <w:szCs w:val="22"/>
+          <w:lang w:val="es-AR"/>
+        </w:rPr>
+        <w:t xml:space="preserve">Autenticación robusta:</w:t>
+      </w:r>
+      <w:r>
+        <w:rPr>
+          <w:rFonts w:ascii="Lexend" w:cs="Lexend" w:eastAsia="Lexend" w:hAnsi="Lexend"/>
+          <w:color w:val="1A1A1A"/>
+          <w:sz w:val="22"/>
+          <w:szCs w:val="22"/>
+          <w:lang w:val="es-AR"/>
+        </w:rPr>
+        <w:t xml:space="preserve"> contraseñas fuertes, certificados o claves SSH. </w:t>
+      </w:r>
+      <w:r>
+        <w:rPr>
+          <w:rFonts w:ascii="Lexend" w:cs="Lexend" w:eastAsia="Lexend" w:hAnsi="Lexend"/>
+          <w:b/>
+          <w:bCs/>
+          <w:color w:val="1A1A1A"/>
+          <w:sz w:val="22"/>
+          <w:szCs w:val="22"/>
+          <w:lang w:val="es-AR"/>
+        </w:rPr>
+        <w:t xml:space="preserve">Telnet (23) se cierra siempre</w:t>
+      </w:r>
+      <w:r>
+        <w:rPr>
+          <w:rFonts w:ascii="Lexend" w:cs="Lexend" w:eastAsia="Lexend" w:hAnsi="Lexend"/>
+          <w:color w:val="1A1A1A"/>
+          <w:sz w:val="22"/>
+          <w:szCs w:val="22"/>
+          <w:lang w:val="es-AR"/>
+        </w:rPr>
+        <w:t xml:space="preserve">, porque viaja sin cifrar.</w:t>
+      </w:r>
+    </w:p>
+    <w:p>
+      <w:pPr>
+        <w:pStyle w:val="ListParagraph"/>
+        <w:numPr>
+          <w:ilvl w:val="0"/>
+          <w:numId w:val="1"/>
+        </w:numPr>
+        <w:spacing w:after="100" w:line="276"/>
+        <w:jc w:val="both"/>
+      </w:pPr>
+      <w:r>
+        <w:rPr>
+          <w:rFonts w:ascii="Lexend" w:cs="Lexend" w:eastAsia="Lexend" w:hAnsi="Lexend"/>
+          <w:b/>
+          <w:bCs/>
+          <w:color w:val="1A1A1A"/>
+          <w:sz w:val="22"/>
+          <w:szCs w:val="22"/>
+          <w:lang w:val="es-AR"/>
+        </w:rPr>
+        <w:t xml:space="preserve">Monitorear</w:t>
+      </w:r>
+      <w:r>
+        <w:rPr>
+          <w:rFonts w:ascii="Lexend" w:cs="Lexend" w:eastAsia="Lexend" w:hAnsi="Lexend"/>
+          <w:color w:val="1A1A1A"/>
+          <w:sz w:val="22"/>
+          <w:szCs w:val="22"/>
+          <w:lang w:val="es-AR"/>
+        </w:rPr>
+        <w:t xml:space="preserve"> qué puertos están en uso, investigar el tráfico raro y sumar un </w:t>
+      </w:r>
+      <w:r>
+        <w:rPr>
+          <w:rFonts w:ascii="Lexend" w:cs="Lexend" w:eastAsia="Lexend" w:hAnsi="Lexend"/>
+          <w:b/>
+          <w:bCs/>
+          <w:color w:val="1A1A1A"/>
+          <w:sz w:val="22"/>
+          <w:szCs w:val="22"/>
+          <w:lang w:val="es-AR"/>
+        </w:rPr>
+        <w:t xml:space="preserve">IDS/IPS</w:t>
+      </w:r>
+      <w:r>
+        <w:rPr>
+          <w:rFonts w:ascii="Lexend" w:cs="Lexend" w:eastAsia="Lexend" w:hAnsi="Lexend"/>
+          <w:color w:val="1A1A1A"/>
+          <w:sz w:val="22"/>
+          <w:szCs w:val="22"/>
+          <w:lang w:val="es-AR"/>
+        </w:rPr>
+        <w:t xml:space="preserve">.</w:t>
+      </w:r>
+    </w:p>
+    <w:p>
+      <w:pPr>
+        <w:spacing w:after="260" w:line="288"/>
+        <w:jc w:val="center"/>
+      </w:pPr>
+      <w:r>
+        <w:rPr>
+          <w:rFonts w:ascii="Lexend" w:cs="Lexend" w:eastAsia="Lexend" w:hAnsi="Lexend"/>
+          <w:b/>
+          <w:bCs/>
+          <w:color w:val="1A1A1A"/>
+          <w:sz w:val="22"/>
+          <w:szCs w:val="22"/>
+          <w:lang w:val="es-AR"/>
+        </w:rPr>
+        <w:t xml:space="preserve">Los puertos UDP también se atacan:</w:t>
+      </w:r>
+    </w:p>
+    <w:p>
+      <w:pPr>
+        <w:pStyle w:val="ListParagraph"/>
+        <w:numPr>
+          <w:ilvl w:val="0"/>
+          <w:numId w:val="1"/>
+        </w:numPr>
+        <w:spacing w:after="100" w:line="276"/>
+        <w:jc w:val="both"/>
+      </w:pPr>
+      <w:r>
+        <w:rPr>
+          <w:rFonts w:ascii="Lexend" w:cs="Lexend" w:eastAsia="Lexend" w:hAnsi="Lexend"/>
+          <w:b/>
+          <w:bCs/>
+          <w:color w:val="1A1A1A"/>
+          <w:sz w:val="22"/>
+          <w:szCs w:val="22"/>
+          <w:lang w:val="es-AR"/>
+        </w:rPr>
+        <w:t xml:space="preserve">DNS (UDP 53):</w:t>
+      </w:r>
+      <w:r>
+        <w:rPr>
+          <w:rFonts w:ascii="Lexend" w:cs="Lexend" w:eastAsia="Lexend" w:hAnsi="Lexend"/>
+          <w:color w:val="1A1A1A"/>
+          <w:sz w:val="22"/>
+          <w:szCs w:val="22"/>
+          <w:lang w:val="es-AR"/>
+        </w:rPr>
+        <w:t xml:space="preserve"> si no hay servidor DNS, se bloquea en el firewall; si lo hay, se </w:t>
+      </w:r>
+      <w:r>
+        <w:rPr>
+          <w:rFonts w:ascii="Lexend" w:cs="Lexend" w:eastAsia="Lexend" w:hAnsi="Lexend"/>
+          <w:b/>
+          <w:bCs/>
+          <w:color w:val="1A1A1A"/>
+          <w:sz w:val="22"/>
+          <w:szCs w:val="22"/>
+          <w:lang w:val="es-AR"/>
+        </w:rPr>
+        <w:t xml:space="preserve">limitan las peticiones por segundo</w:t>
+      </w:r>
+      <w:r>
+        <w:rPr>
+          <w:rFonts w:ascii="Lexend" w:cs="Lexend" w:eastAsia="Lexend" w:hAnsi="Lexend"/>
+          <w:color w:val="1A1A1A"/>
+          <w:sz w:val="22"/>
+          <w:szCs w:val="22"/>
+          <w:lang w:val="es-AR"/>
+        </w:rPr>
+        <w:t xml:space="preserve"> y se banean IP. </w:t>
+      </w:r>
+      <w:r>
+        <w:rPr>
+          <w:rFonts w:ascii="Lexend" w:cs="Lexend" w:eastAsia="Lexend" w:hAnsi="Lexend"/>
+          <w:b/>
+          <w:bCs/>
+          <w:color w:val="1A1A1A"/>
+          <w:sz w:val="22"/>
+          <w:szCs w:val="22"/>
+          <w:lang w:val="es-AR"/>
+        </w:rPr>
+        <w:t xml:space="preserve">Fail2ban</w:t>
+      </w:r>
+      <w:r>
+        <w:rPr>
+          <w:rFonts w:ascii="Lexend" w:cs="Lexend" w:eastAsia="Lexend" w:hAnsi="Lexend"/>
+          <w:color w:val="1A1A1A"/>
+          <w:sz w:val="22"/>
+          <w:szCs w:val="22"/>
+          <w:lang w:val="es-AR"/>
+        </w:rPr>
+        <w:t xml:space="preserve"> lee los logs y le pide al firewall que bloquee las IP que generan tráfico anormal.</w:t>
+      </w:r>
+    </w:p>
+    <w:p>
+      <w:pPr>
+        <w:pStyle w:val="ListParagraph"/>
+        <w:numPr>
+          <w:ilvl w:val="0"/>
+          <w:numId w:val="1"/>
+        </w:numPr>
+        <w:spacing w:after="100" w:line="276"/>
+        <w:jc w:val="both"/>
+      </w:pPr>
+      <w:r>
+        <w:rPr>
+          <w:rFonts w:ascii="Lexend" w:cs="Lexend" w:eastAsia="Lexend" w:hAnsi="Lexend"/>
+          <w:b/>
+          <w:bCs/>
+          <w:color w:val="1A1A1A"/>
+          <w:sz w:val="22"/>
+          <w:szCs w:val="22"/>
+          <w:lang w:val="es-AR"/>
+        </w:rPr>
+        <w:t xml:space="preserve">DHCP (UDP 67/68):</w:t>
+      </w:r>
+      <w:r>
+        <w:rPr>
+          <w:rFonts w:ascii="Lexend" w:cs="Lexend" w:eastAsia="Lexend" w:hAnsi="Lexend"/>
+          <w:color w:val="1A1A1A"/>
+          <w:sz w:val="22"/>
+          <w:szCs w:val="22"/>
+          <w:lang w:val="es-AR"/>
+        </w:rPr>
+        <w:t xml:space="preserve"> se puede saturar con </w:t>
+      </w:r>
+      <w:r>
+        <w:rPr>
+          <w:rFonts w:ascii="Lexend" w:cs="Lexend" w:eastAsia="Lexend" w:hAnsi="Lexend"/>
+          <w:i/>
+          <w:iCs/>
+          <w:color w:val="1A1A1A"/>
+          <w:sz w:val="22"/>
+          <w:szCs w:val="22"/>
+          <w:lang w:val="es-AR"/>
+        </w:rPr>
+        <w:t xml:space="preserve">DHCP Discover</w:t>
+      </w:r>
+      <w:r>
+        <w:rPr>
+          <w:rFonts w:ascii="Lexend" w:cs="Lexend" w:eastAsia="Lexend" w:hAnsi="Lexend"/>
+          <w:color w:val="1A1A1A"/>
+          <w:sz w:val="22"/>
+          <w:szCs w:val="22"/>
+          <w:lang w:val="es-AR"/>
+        </w:rPr>
+        <w:t xml:space="preserve"> o escanear para buscar versiones vulnerables. Si no se usa, se deshabilita.</w:t>
+      </w:r>
+    </w:p>
+    <w:p>
+      <w:pPr>
+        <w:pStyle w:val="ListParagraph"/>
+        <w:numPr>
+          <w:ilvl w:val="0"/>
+          <w:numId w:val="1"/>
+        </w:numPr>
+        <w:spacing w:after="100" w:line="276"/>
+        <w:jc w:val="both"/>
+      </w:pPr>
+      <w:r>
+        <w:rPr>
+          <w:rFonts w:ascii="Lexend" w:cs="Lexend" w:eastAsia="Lexend" w:hAnsi="Lexend"/>
+          <w:b/>
+          <w:bCs/>
+          <w:color w:val="1A1A1A"/>
+          <w:sz w:val="22"/>
+          <w:szCs w:val="22"/>
+          <w:lang w:val="es-AR"/>
+        </w:rPr>
+        <w:t xml:space="preserve">SNMP (UDP 161/162):</w:t>
+      </w:r>
+      <w:r>
+        <w:rPr>
+          <w:rFonts w:ascii="Lexend" w:cs="Lexend" w:eastAsia="Lexend" w:hAnsi="Lexend"/>
+          <w:color w:val="1A1A1A"/>
+          <w:sz w:val="22"/>
+          <w:szCs w:val="22"/>
+          <w:lang w:val="es-AR"/>
+        </w:rPr>
+        <w:t xml:space="preserve"> corre con permisos de administrador. </w:t>
+      </w:r>
+      <w:r>
+        <w:rPr>
+          <w:rFonts w:ascii="Lexend" w:cs="Lexend" w:eastAsia="Lexend" w:hAnsi="Lexend"/>
+          <w:b/>
+          <w:bCs/>
+          <w:color w:val="1A1A1A"/>
+          <w:sz w:val="22"/>
+          <w:szCs w:val="22"/>
+          <w:lang w:val="es-AR"/>
+        </w:rPr>
+        <w:t xml:space="preserve">SNMPv2c viaja en texto claro</w:t>
+      </w:r>
+      <w:r>
+        <w:rPr>
+          <w:rFonts w:ascii="Lexend" w:cs="Lexend" w:eastAsia="Lexend" w:hAnsi="Lexend"/>
+          <w:color w:val="1A1A1A"/>
+          <w:sz w:val="22"/>
+          <w:szCs w:val="22"/>
+          <w:lang w:val="es-AR"/>
+        </w:rPr>
+        <w:t xml:space="preserve">; </w:t>
+      </w:r>
+      <w:r>
+        <w:rPr>
+          <w:rFonts w:ascii="Lexend" w:cs="Lexend" w:eastAsia="Lexend" w:hAnsi="Lexend"/>
+          <w:b/>
+          <w:bCs/>
+          <w:color w:val="1A1A1A"/>
+          <w:sz w:val="22"/>
+          <w:szCs w:val="22"/>
+          <w:lang w:val="es-AR"/>
+        </w:rPr>
+        <w:t xml:space="preserve">SNMPv3 agrega autenticación y cifrado</w:t>
+      </w:r>
+      <w:r>
+        <w:rPr>
+          <w:rFonts w:ascii="Lexend" w:cs="Lexend" w:eastAsia="Lexend" w:hAnsi="Lexend"/>
+          <w:color w:val="1A1A1A"/>
+          <w:sz w:val="22"/>
+          <w:szCs w:val="22"/>
+          <w:lang w:val="es-AR"/>
+        </w:rPr>
+        <w:t xml:space="preserve">. Si no se usa, se deshabilita o se bloquean los puertos. Responder solo a ciertas IP no alcanza, porque con UDP el spoofing es fácil; conviene separar la red de gestión en </w:t>
+      </w:r>
+      <w:r>
+        <w:rPr>
+          <w:rFonts w:ascii="Lexend" w:cs="Lexend" w:eastAsia="Lexend" w:hAnsi="Lexend"/>
+          <w:b/>
+          <w:bCs/>
+          <w:color w:val="1A1A1A"/>
+          <w:sz w:val="22"/>
+          <w:szCs w:val="22"/>
+          <w:lang w:val="es-AR"/>
+        </w:rPr>
+        <w:t xml:space="preserve">VLAN</w:t>
+      </w:r>
+      <w:r>
+        <w:rPr>
+          <w:rFonts w:ascii="Lexend" w:cs="Lexend" w:eastAsia="Lexend" w:hAnsi="Lexend"/>
+          <w:color w:val="1A1A1A"/>
+          <w:sz w:val="22"/>
+          <w:szCs w:val="22"/>
+          <w:lang w:val="es-AR"/>
+        </w:rPr>
+        <w:t xml:space="preserve"> o usarlo dentro de un túnel SSH o VPN.</w:t>
+      </w:r>
+    </w:p>
+    <w:p>
+      <w:pPr>
+        <w:spacing w:after="260" w:line="288"/>
+        <w:jc w:val="center"/>
+      </w:pPr>
+      <w:r>
+        <w:rPr>
+          <w:rFonts w:ascii="Lexend" w:cs="Lexend" w:eastAsia="Lexend" w:hAnsi="Lexend"/>
+          <w:b/>
+          <w:bCs/>
+          <w:color w:val="1A1A1A"/>
+          <w:sz w:val="22"/>
+          <w:szCs w:val="22"/>
+          <w:lang w:val="es-AR"/>
+        </w:rPr>
+        <w:t xml:space="preserve">Cómo ver qué puertos tenés abiertos:</w:t>
+      </w:r>
+    </w:p>
+    <w:p>
+      <w:pPr>
+        <w:pStyle w:val="ListParagraph"/>
+        <w:numPr>
+          <w:ilvl w:val="0"/>
+          <w:numId w:val="1"/>
+        </w:numPr>
+        <w:spacing w:after="100" w:line="276"/>
+        <w:jc w:val="both"/>
+      </w:pPr>
+      <w:r>
+        <w:rPr>
+          <w:rFonts w:ascii="Lexend" w:cs="Lexend" w:eastAsia="Lexend" w:hAnsi="Lexend"/>
+          <w:b/>
+          <w:bCs/>
+          <w:color w:val="1A1A1A"/>
+          <w:sz w:val="22"/>
+          <w:szCs w:val="22"/>
+          <w:lang w:val="es-AR"/>
+        </w:rPr>
+        <w:t xml:space="preserve">Desde Internet:</w:t>
+      </w:r>
+      <w:r>
+        <w:rPr>
+          <w:rFonts w:ascii="Lexend" w:cs="Lexend" w:eastAsia="Lexend" w:hAnsi="Lexend"/>
+          <w:color w:val="1A1A1A"/>
+          <w:sz w:val="22"/>
+          <w:szCs w:val="22"/>
+          <w:lang w:val="es-AR"/>
+        </w:rPr>
+        <w:t xml:space="preserve"> con un test de puertos web contra tu IP pública.</w:t>
+      </w:r>
+    </w:p>
+    <w:p>
+      <w:pPr>
+        <w:pStyle w:val="ListParagraph"/>
+        <w:numPr>
+          <w:ilvl w:val="0"/>
+          <w:numId w:val="1"/>
+        </w:numPr>
+        <w:spacing w:after="100" w:line="276"/>
+        <w:jc w:val="both"/>
+      </w:pPr>
+      <w:r>
+        <w:rPr>
+          <w:rFonts w:ascii="Lexend" w:cs="Lexend" w:eastAsia="Lexend" w:hAnsi="Lexend"/>
+          <w:b/>
+          <w:bCs/>
+          <w:color w:val="1A1A1A"/>
+          <w:sz w:val="22"/>
+          <w:szCs w:val="22"/>
+          <w:lang w:val="es-AR"/>
+        </w:rPr>
+        <w:t xml:space="preserve">Desde la LAN:</w:t>
+      </w:r>
+      <w:r>
+        <w:rPr>
+          <w:rFonts w:ascii="Lexend" w:cs="Lexend" w:eastAsia="Lexend" w:hAnsi="Lexend"/>
+          <w:color w:val="1A1A1A"/>
+          <w:sz w:val="22"/>
+          <w:szCs w:val="22"/>
+          <w:lang w:val="es-AR"/>
+        </w:rPr>
+        <w:t xml:space="preserve"> con </w:t>
+      </w:r>
+      <w:r>
+        <w:rPr>
+          <w:rFonts w:ascii="Lexend" w:cs="Lexend" w:eastAsia="Lexend" w:hAnsi="Lexend"/>
+          <w:b/>
+          <w:bCs/>
+          <w:color w:val="1A1A1A"/>
+          <w:sz w:val="22"/>
+          <w:szCs w:val="22"/>
+          <w:lang w:val="es-AR"/>
+        </w:rPr>
+        <w:t xml:space="preserve">Nmap</w:t>
+      </w:r>
+      <w:r>
+        <w:rPr>
+          <w:rFonts w:ascii="Lexend" w:cs="Lexend" w:eastAsia="Lexend" w:hAnsi="Lexend"/>
+          <w:color w:val="1A1A1A"/>
+          <w:sz w:val="22"/>
+          <w:szCs w:val="22"/>
+          <w:lang w:val="es-AR"/>
+        </w:rPr>
+        <w:t xml:space="preserve"> (</w:t>
+      </w:r>
+      <w:r>
+        <w:rPr>
+          <w:rFonts w:ascii="Consolas" w:cs="Consolas" w:eastAsia="Consolas" w:hAnsi="Consolas"/>
+          <w:color w:val="1A1A1A"/>
+          <w:sz w:val="20"/>
+          <w:szCs w:val="20"/>
+          <w:lang w:val="es-AR"/>
+        </w:rPr>
+        <w:t xml:space="preserve">-sU</w:t>
+      </w:r>
+      <w:r>
+        <w:rPr>
+          <w:rFonts w:ascii="Lexend" w:cs="Lexend" w:eastAsia="Lexend" w:hAnsi="Lexend"/>
+          <w:color w:val="1A1A1A"/>
+          <w:sz w:val="22"/>
+          <w:szCs w:val="22"/>
+          <w:lang w:val="es-AR"/>
+        </w:rPr>
+        <w:t xml:space="preserve"> para UDP, </w:t>
+      </w:r>
+      <w:r>
+        <w:rPr>
+          <w:rFonts w:ascii="Consolas" w:cs="Consolas" w:eastAsia="Consolas" w:hAnsi="Consolas"/>
+          <w:color w:val="1A1A1A"/>
+          <w:sz w:val="20"/>
+          <w:szCs w:val="20"/>
+          <w:lang w:val="es-AR"/>
+        </w:rPr>
+        <w:t xml:space="preserve">-sS</w:t>
+      </w:r>
+      <w:r>
+        <w:rPr>
+          <w:rFonts w:ascii="Lexend" w:cs="Lexend" w:eastAsia="Lexend" w:hAnsi="Lexend"/>
+          <w:color w:val="1A1A1A"/>
+          <w:sz w:val="22"/>
+          <w:szCs w:val="22"/>
+          <w:lang w:val="es-AR"/>
+        </w:rPr>
+        <w:t xml:space="preserve"> para TCP). Nmap clasifica el puerto según la respuesta: hay contestación → </w:t>
+      </w:r>
+      <w:r>
+        <w:rPr>
+          <w:rFonts w:ascii="Lexend" w:cs="Lexend" w:eastAsia="Lexend" w:hAnsi="Lexend"/>
+          <w:b/>
+          <w:bCs/>
+          <w:color w:val="1A1A1A"/>
+          <w:sz w:val="22"/>
+          <w:szCs w:val="22"/>
+          <w:lang w:val="es-AR"/>
+        </w:rPr>
+        <w:t xml:space="preserve">abierto</w:t>
+      </w:r>
+      <w:r>
+        <w:rPr>
+          <w:rFonts w:ascii="Lexend" w:cs="Lexend" w:eastAsia="Lexend" w:hAnsi="Lexend"/>
+          <w:color w:val="1A1A1A"/>
+          <w:sz w:val="22"/>
+          <w:szCs w:val="22"/>
+          <w:lang w:val="es-AR"/>
+        </w:rPr>
+        <w:t xml:space="preserve">; no hay respuesta → </w:t>
+      </w:r>
+      <w:r>
+        <w:rPr>
+          <w:rFonts w:ascii="Lexend" w:cs="Lexend" w:eastAsia="Lexend" w:hAnsi="Lexend"/>
+          <w:b/>
+          <w:bCs/>
+          <w:color w:val="1A1A1A"/>
+          <w:sz w:val="22"/>
+          <w:szCs w:val="22"/>
+          <w:lang w:val="es-AR"/>
+        </w:rPr>
+        <w:t xml:space="preserve">abierto/filtrado</w:t>
+      </w:r>
+      <w:r>
+        <w:rPr>
+          <w:rFonts w:ascii="Lexend" w:cs="Lexend" w:eastAsia="Lexend" w:hAnsi="Lexend"/>
+          <w:color w:val="1A1A1A"/>
+          <w:sz w:val="22"/>
+          <w:szCs w:val="22"/>
+          <w:lang w:val="es-AR"/>
+        </w:rPr>
+        <w:t xml:space="preserve">; ICMP tipo 3 </w:t>
+      </w:r>
+      <w:r>
+        <w:rPr>
+          <w:rFonts w:ascii="Lexend" w:cs="Lexend" w:eastAsia="Lexend" w:hAnsi="Lexend"/>
+          <w:i/>
+          <w:iCs/>
+          <w:color w:val="1A1A1A"/>
+          <w:sz w:val="22"/>
+          <w:szCs w:val="22"/>
+          <w:lang w:val="es-AR"/>
+        </w:rPr>
+        <w:t xml:space="preserve">port unreachable</w:t>
+      </w:r>
+      <w:r>
+        <w:rPr>
+          <w:rFonts w:ascii="Lexend" w:cs="Lexend" w:eastAsia="Lexend" w:hAnsi="Lexend"/>
+          <w:color w:val="1A1A1A"/>
+          <w:sz w:val="22"/>
+          <w:szCs w:val="22"/>
+          <w:lang w:val="es-AR"/>
+        </w:rPr>
+        <w:t xml:space="preserve"> → </w:t>
+      </w:r>
+      <w:r>
+        <w:rPr>
+          <w:rFonts w:ascii="Lexend" w:cs="Lexend" w:eastAsia="Lexend" w:hAnsi="Lexend"/>
+          <w:b/>
+          <w:bCs/>
+          <w:color w:val="1A1A1A"/>
+          <w:sz w:val="22"/>
+          <w:szCs w:val="22"/>
+          <w:lang w:val="es-AR"/>
+        </w:rPr>
+        <w:t xml:space="preserve">cerrado</w:t>
+      </w:r>
+      <w:r>
+        <w:rPr>
+          <w:rFonts w:ascii="Lexend" w:cs="Lexend" w:eastAsia="Lexend" w:hAnsi="Lexend"/>
+          <w:color w:val="1A1A1A"/>
+          <w:sz w:val="22"/>
+          <w:szCs w:val="22"/>
+          <w:lang w:val="es-AR"/>
+        </w:rPr>
+        <w:t xml:space="preserve">; otro error ICMP → </w:t>
+      </w:r>
+      <w:r>
+        <w:rPr>
+          <w:rFonts w:ascii="Lexend" w:cs="Lexend" w:eastAsia="Lexend" w:hAnsi="Lexend"/>
+          <w:b/>
+          <w:bCs/>
+          <w:color w:val="1A1A1A"/>
+          <w:sz w:val="22"/>
+          <w:szCs w:val="22"/>
+          <w:lang w:val="es-AR"/>
+        </w:rPr>
+        <w:t xml:space="preserve">filtrado</w:t>
       </w:r>
       <w:r>
         <w:rPr>
@@ -11754,6 +12791,216 @@
           <w:szCs w:val="22"/>
           <w:lang w:val="es-AR"/>
         </w:rPr>
+        <w:t xml:space="preserve">Por qué hace falta un NGFW:</w:t>
+      </w:r>
+      <w:r>
+        <w:rPr>
+          <w:rFonts w:ascii="Lexend" w:cs="Lexend" w:eastAsia="Lexend" w:hAnsi="Lexend"/>
+          <w:color w:val="1A1A1A"/>
+          <w:sz w:val="22"/>
+          <w:szCs w:val="22"/>
+          <w:lang w:val="es-AR"/>
+        </w:rPr>
+        <w:t xml:space="preserve"> el </w:t>
+      </w:r>
+      <w:r>
+        <w:rPr>
+          <w:rFonts w:ascii="Lexend" w:cs="Lexend" w:eastAsia="Lexend" w:hAnsi="Lexend"/>
+          <w:i/>
+          <w:iCs/>
+          <w:color w:val="1A1A1A"/>
+          <w:sz w:val="22"/>
+          <w:szCs w:val="22"/>
+          <w:lang w:val="es-AR"/>
+        </w:rPr>
+        <w:t xml:space="preserve">stateful</w:t>
+      </w:r>
+      <w:r>
+        <w:rPr>
+          <w:rFonts w:ascii="Lexend" w:cs="Lexend" w:eastAsia="Lexend" w:hAnsi="Lexend"/>
+          <w:color w:val="1A1A1A"/>
+          <w:sz w:val="22"/>
+          <w:szCs w:val="22"/>
+          <w:lang w:val="es-AR"/>
+        </w:rPr>
+        <w:t xml:space="preserve"> solo mira headers y estado, pero hoy muchas aplicaciones comparten el mismo puerto (casi todo va por el 443). Mirando el puerto, el firewall no puede distinguir una web legítima de una aplicación no permitida. El NGFW </w:t>
+      </w:r>
+      <w:r>
+        <w:rPr>
+          <w:rFonts w:ascii="Lexend" w:cs="Lexend" w:eastAsia="Lexend" w:hAnsi="Lexend"/>
+          <w:b/>
+          <w:bCs/>
+          <w:color w:val="1A1A1A"/>
+          <w:sz w:val="22"/>
+          <w:szCs w:val="22"/>
+          <w:lang w:val="es-AR"/>
+        </w:rPr>
+        <w:t xml:space="preserve">identifica la aplicación sin importar el puerto</w:t>
+      </w:r>
+      <w:r>
+        <w:rPr>
+          <w:rFonts w:ascii="Lexend" w:cs="Lexend" w:eastAsia="Lexend" w:hAnsi="Lexend"/>
+          <w:color w:val="1A1A1A"/>
+          <w:sz w:val="22"/>
+          <w:szCs w:val="22"/>
+          <w:lang w:val="es-AR"/>
+        </w:rPr>
+        <w:t xml:space="preserve">.</w:t>
+      </w:r>
+    </w:p>
+    <w:p>
+      <w:pPr>
+        <w:spacing w:after="120" w:line="280"/>
+        <w:jc w:val="both"/>
+      </w:pPr>
+      <w:r>
+        <w:rPr>
+          <w:rFonts w:ascii="Lexend" w:cs="Lexend" w:eastAsia="Lexend" w:hAnsi="Lexend"/>
+          <w:b/>
+          <w:bCs/>
+          <w:color w:val="1A1A1A"/>
+          <w:sz w:val="22"/>
+          <w:szCs w:val="22"/>
+          <w:lang w:val="es-AR"/>
+        </w:rPr>
+        <w:t xml:space="preserve">El firewall en el modelo OSI:</w:t>
+      </w:r>
+      <w:r>
+        <w:rPr>
+          <w:rFonts w:ascii="Lexend" w:cs="Lexend" w:eastAsia="Lexend" w:hAnsi="Lexend"/>
+          <w:color w:val="1A1A1A"/>
+          <w:sz w:val="22"/>
+          <w:szCs w:val="22"/>
+          <w:lang w:val="es-AR"/>
+        </w:rPr>
+        <w:t xml:space="preserve"> el </w:t>
+      </w:r>
+      <w:r>
+        <w:rPr>
+          <w:rFonts w:ascii="Lexend" w:cs="Lexend" w:eastAsia="Lexend" w:hAnsi="Lexend"/>
+          <w:i/>
+          <w:iCs/>
+          <w:color w:val="1A1A1A"/>
+          <w:sz w:val="22"/>
+          <w:szCs w:val="22"/>
+          <w:lang w:val="es-AR"/>
+        </w:rPr>
+        <w:t xml:space="preserve">stateless</w:t>
+      </w:r>
+      <w:r>
+        <w:rPr>
+          <w:rFonts w:ascii="Lexend" w:cs="Lexend" w:eastAsia="Lexend" w:hAnsi="Lexend"/>
+          <w:color w:val="1A1A1A"/>
+          <w:sz w:val="22"/>
+          <w:szCs w:val="22"/>
+          <w:lang w:val="es-AR"/>
+        </w:rPr>
+        <w:t xml:space="preserve"> y el </w:t>
+      </w:r>
+      <w:r>
+        <w:rPr>
+          <w:rFonts w:ascii="Lexend" w:cs="Lexend" w:eastAsia="Lexend" w:hAnsi="Lexend"/>
+          <w:i/>
+          <w:iCs/>
+          <w:color w:val="1A1A1A"/>
+          <w:sz w:val="22"/>
+          <w:szCs w:val="22"/>
+          <w:lang w:val="es-AR"/>
+        </w:rPr>
+        <w:t xml:space="preserve">stateful</w:t>
+      </w:r>
+      <w:r>
+        <w:rPr>
+          <w:rFonts w:ascii="Lexend" w:cs="Lexend" w:eastAsia="Lexend" w:hAnsi="Lexend"/>
+          <w:color w:val="1A1A1A"/>
+          <w:sz w:val="22"/>
+          <w:szCs w:val="22"/>
+          <w:lang w:val="es-AR"/>
+        </w:rPr>
+        <w:t xml:space="preserve"> trabajan en las capas </w:t>
+      </w:r>
+      <w:r>
+        <w:rPr>
+          <w:rFonts w:ascii="Lexend" w:cs="Lexend" w:eastAsia="Lexend" w:hAnsi="Lexend"/>
+          <w:b/>
+          <w:bCs/>
+          <w:color w:val="1A1A1A"/>
+          <w:sz w:val="22"/>
+          <w:szCs w:val="22"/>
+          <w:lang w:val="es-AR"/>
+        </w:rPr>
+        <w:t xml:space="preserve">3 y 4</w:t>
+      </w:r>
+      <w:r>
+        <w:rPr>
+          <w:rFonts w:ascii="Lexend" w:cs="Lexend" w:eastAsia="Lexend" w:hAnsi="Lexend"/>
+          <w:color w:val="1A1A1A"/>
+          <w:sz w:val="22"/>
+          <w:szCs w:val="22"/>
+          <w:lang w:val="es-AR"/>
+        </w:rPr>
+        <w:t xml:space="preserve"> (Internet y transporte en TCP/IP), el proxy en la </w:t>
+      </w:r>
+      <w:r>
+        <w:rPr>
+          <w:rFonts w:ascii="Lexend" w:cs="Lexend" w:eastAsia="Lexend" w:hAnsi="Lexend"/>
+          <w:b/>
+          <w:bCs/>
+          <w:color w:val="1A1A1A"/>
+          <w:sz w:val="22"/>
+          <w:szCs w:val="22"/>
+          <w:lang w:val="es-AR"/>
+        </w:rPr>
+        <w:t xml:space="preserve">7</w:t>
+      </w:r>
+      <w:r>
+        <w:rPr>
+          <w:rFonts w:ascii="Lexend" w:cs="Lexend" w:eastAsia="Lexend" w:hAnsi="Lexend"/>
+          <w:color w:val="1A1A1A"/>
+          <w:sz w:val="22"/>
+          <w:szCs w:val="22"/>
+          <w:lang w:val="es-AR"/>
+        </w:rPr>
+        <w:t xml:space="preserve"> (aplicación) y el NGFW de la </w:t>
+      </w:r>
+      <w:r>
+        <w:rPr>
+          <w:rFonts w:ascii="Lexend" w:cs="Lexend" w:eastAsia="Lexend" w:hAnsi="Lexend"/>
+          <w:b/>
+          <w:bCs/>
+          <w:color w:val="1A1A1A"/>
+          <w:sz w:val="22"/>
+          <w:szCs w:val="22"/>
+          <w:lang w:val="es-AR"/>
+        </w:rPr>
+        <w:t xml:space="preserve">3 a la 7</w:t>
+      </w:r>
+      <w:r>
+        <w:rPr>
+          <w:rFonts w:ascii="Lexend" w:cs="Lexend" w:eastAsia="Lexend" w:hAnsi="Lexend"/>
+          <w:color w:val="1A1A1A"/>
+          <w:sz w:val="22"/>
+          <w:szCs w:val="22"/>
+          <w:lang w:val="es-AR"/>
+        </w:rPr>
+        <w:t xml:space="preserve">. Cuanto más arriba inspecciona, más ve, pero más procesamiento necesita.</w:t>
+      </w:r>
+    </w:p>
+    <w:p>
+      <w:pPr>
+        <w:spacing w:after="120" w:line="280"/>
+        <w:jc w:val="both"/>
+      </w:pPr>
+      <w:r>
+        <w:rPr>
+          <w:rFonts w:ascii="Lexend" w:cs="Lexend" w:eastAsia="Lexend" w:hAnsi="Lexend"/>
+          <w:b/>
+          <w:bCs/>
+          <w:color w:val="1A1A1A"/>
+          <w:sz w:val="22"/>
+          <w:szCs w:val="22"/>
+          <w:lang w:val="es-AR"/>
+        </w:rPr>
         <w:t xml:space="preserve">NGFW, servicios extra:</w:t>
       </w:r>
       <w:r>
@@ -11830,7 +13077,29 @@
           <w:szCs w:val="22"/>
           <w:lang w:val="es-AR"/>
         </w:rPr>
-        <w:t xml:space="preserve"> SSL/TLS, antimalware, </w:t>
+        <w:t xml:space="preserve"> SSL/TLS (para verlo tiene que descifrarlo, lo que plantea </w:t>
+      </w:r>
+      <w:r>
+        <w:rPr>
+          <w:rFonts w:ascii="Lexend" w:cs="Lexend" w:eastAsia="Lexend" w:hAnsi="Lexend"/>
+          <w:b/>
+          <w:bCs/>
+          <w:color w:val="1A1A1A"/>
+          <w:sz w:val="22"/>
+          <w:szCs w:val="22"/>
+          <w:lang w:val="es-AR"/>
+        </w:rPr>
+        <w:t xml:space="preserve">cuestiones de privacidad</w:t>
+      </w:r>
+      <w:r>
+        <w:rPr>
+          <w:rFonts w:ascii="Lexend" w:cs="Lexend" w:eastAsia="Lexend" w:hAnsi="Lexend"/>
+          <w:color w:val="1A1A1A"/>
+          <w:sz w:val="22"/>
+          <w:szCs w:val="22"/>
+          <w:lang w:val="es-AR"/>
+        </w:rPr>
+        <w:t xml:space="preserve">), antimalware, </w:t>
       </w:r>
       <w:r>
         <w:rPr>
@@ -12628,7 +13897,51 @@
           <w:szCs w:val="22"/>
           <w:lang w:val="es-AR"/>
         </w:rPr>
-        <w:t xml:space="preserve"> (red y seguridad en la nube), automatización con IA, firewalls para industria e IoT.</w:t>
+        <w:t xml:space="preserve"> (</w:t>
+      </w:r>
+      <w:r>
+        <w:rPr>
+          <w:rFonts w:ascii="Lexend" w:cs="Lexend" w:eastAsia="Lexend" w:hAnsi="Lexend"/>
+          <w:i/>
+          <w:iCs/>
+          <w:color w:val="1A1A1A"/>
+          <w:sz w:val="22"/>
+          <w:szCs w:val="22"/>
+          <w:lang w:val="es-AR"/>
+        </w:rPr>
+        <w:t xml:space="preserve">Secure Access Service Edge</w:t>
+      </w:r>
+      <w:r>
+        <w:rPr>
+          <w:rFonts w:ascii="Lexend" w:cs="Lexend" w:eastAsia="Lexend" w:hAnsi="Lexend"/>
+          <w:color w:val="1A1A1A"/>
+          <w:sz w:val="22"/>
+          <w:szCs w:val="22"/>
+          <w:lang w:val="es-AR"/>
+        </w:rPr>
+        <w:t xml:space="preserve">: junta en la nube la red, </w:t>
+      </w:r>
+      <w:r>
+        <w:rPr>
+          <w:rFonts w:ascii="Lexend" w:cs="Lexend" w:eastAsia="Lexend" w:hAnsi="Lexend"/>
+          <w:b/>
+          <w:bCs/>
+          <w:color w:val="1A1A1A"/>
+          <w:sz w:val="22"/>
+          <w:szCs w:val="22"/>
+          <w:lang w:val="es-AR"/>
+        </w:rPr>
+        <w:t xml:space="preserve">SD-WAN</w:t>
+      </w:r>
+      <w:r>
+        <w:rPr>
+          <w:rFonts w:ascii="Lexend" w:cs="Lexend" w:eastAsia="Lexend" w:hAnsi="Lexend"/>
+          <w:color w:val="1A1A1A"/>
+          <w:sz w:val="22"/>
+          <w:szCs w:val="22"/>
+          <w:lang w:val="es-AR"/>
+        </w:rPr>
+        <w:t xml:space="preserve">, con la seguridad: firewall, CASB y ZTNA), automatización con IA/ML, firewalls para industria e IoT (entornos OT).</w:t>
       </w:r>
     </w:p>
     <w:p>
@@ -15113,6 +16426,648 @@
     </w:p>
     <w:p>
       <w:pPr>
+        <w:spacing w:after="260" w:line="288"/>
+        <w:jc w:val="center"/>
+      </w:pPr>
+      <w:r>
+        <w:rPr>
+          <w:rFonts w:ascii="Lexend" w:cs="Lexend" w:eastAsia="Lexend" w:hAnsi="Lexend"/>
+          <w:b/>
+          <w:bCs/>
+          <w:color w:val="1A1A1A"/>
+          <w:sz w:val="22"/>
+          <w:szCs w:val="22"/>
+          <w:lang w:val="es-AR"/>
+        </w:rPr>
+        <w:t xml:space="preserve">24) ¿Por qué un puerto abierto es un riesgo y cómo se protegen los puertos?</w:t>
+      </w:r>
+    </w:p>
+    <w:p>
+      <w:pPr>
+        <w:spacing w:after="120" w:line="280"/>
+        <w:jc w:val="both"/>
+      </w:pPr>
+      <w:r>
+        <w:rPr>
+          <w:rFonts w:ascii="Lexend" w:cs="Lexend" w:eastAsia="Lexend" w:hAnsi="Lexend"/>
+          <w:color w:val="1A1A1A"/>
+          <w:sz w:val="22"/>
+          <w:szCs w:val="22"/>
+          <w:lang w:val="es-AR"/>
+        </w:rPr>
+        <w:t xml:space="preserve">Un puerto abierto expone el servicio que escucha detrás. Por ahí pueden entrar </w:t>
+      </w:r>
+      <w:r>
+        <w:rPr>
+          <w:rFonts w:ascii="Lexend" w:cs="Lexend" w:eastAsia="Lexend" w:hAnsi="Lexend"/>
+          <w:b/>
+          <w:bCs/>
+          <w:color w:val="1A1A1A"/>
+          <w:sz w:val="22"/>
+          <w:szCs w:val="22"/>
+          <w:lang w:val="es-AR"/>
+        </w:rPr>
+        <w:t xml:space="preserve">malware y accesos no autorizados</w:t>
+      </w:r>
+      <w:r>
+        <w:rPr>
+          <w:rFonts w:ascii="Lexend" w:cs="Lexend" w:eastAsia="Lexend" w:hAnsi="Lexend"/>
+          <w:color w:val="1A1A1A"/>
+          <w:sz w:val="22"/>
+          <w:szCs w:val="22"/>
+          <w:lang w:val="es-AR"/>
+        </w:rPr>
+        <w:t xml:space="preserve">, un </w:t>
+      </w:r>
+      <w:r>
+        <w:rPr>
+          <w:rFonts w:ascii="Lexend" w:cs="Lexend" w:eastAsia="Lexend" w:hAnsi="Lexend"/>
+          <w:b/>
+          <w:bCs/>
+          <w:color w:val="1A1A1A"/>
+          <w:sz w:val="22"/>
+          <w:szCs w:val="22"/>
+          <w:lang w:val="es-AR"/>
+        </w:rPr>
+        <w:t xml:space="preserve">escaneo</w:t>
+      </w:r>
+      <w:r>
+        <w:rPr>
+          <w:rFonts w:ascii="Lexend" w:cs="Lexend" w:eastAsia="Lexend" w:hAnsi="Lexend"/>
+          <w:color w:val="1A1A1A"/>
+          <w:sz w:val="22"/>
+          <w:szCs w:val="22"/>
+          <w:lang w:val="es-AR"/>
+        </w:rPr>
+        <w:t xml:space="preserve"> permite averiguar servicios y versiones vulnerables, y se puede saturar el servicio con un </w:t>
+      </w:r>
+      <w:r>
+        <w:rPr>
+          <w:rFonts w:ascii="Lexend" w:cs="Lexend" w:eastAsia="Lexend" w:hAnsi="Lexend"/>
+          <w:b/>
+          <w:bCs/>
+          <w:color w:val="1A1A1A"/>
+          <w:sz w:val="22"/>
+          <w:szCs w:val="22"/>
+          <w:lang w:val="es-AR"/>
+        </w:rPr>
+        <w:t xml:space="preserve">DoS</w:t>
+      </w:r>
+      <w:r>
+        <w:rPr>
+          <w:rFonts w:ascii="Lexend" w:cs="Lexend" w:eastAsia="Lexend" w:hAnsi="Lexend"/>
+          <w:color w:val="1A1A1A"/>
+          <w:sz w:val="22"/>
+          <w:szCs w:val="22"/>
+          <w:lang w:val="es-AR"/>
+        </w:rPr>
+        <w:t xml:space="preserve">. Para protegerlos: </w:t>
+      </w:r>
+      <w:r>
+        <w:rPr>
+          <w:rFonts w:ascii="Lexend" w:cs="Lexend" w:eastAsia="Lexend" w:hAnsi="Lexend"/>
+          <w:b/>
+          <w:bCs/>
+          <w:color w:val="1A1A1A"/>
+          <w:sz w:val="22"/>
+          <w:szCs w:val="22"/>
+          <w:lang w:val="es-AR"/>
+        </w:rPr>
+        <w:t xml:space="preserve">todo cerrado por defecto</w:t>
+      </w:r>
+      <w:r>
+        <w:rPr>
+          <w:rFonts w:ascii="Lexend" w:cs="Lexend" w:eastAsia="Lexend" w:hAnsi="Lexend"/>
+          <w:color w:val="1A1A1A"/>
+          <w:sz w:val="22"/>
+          <w:szCs w:val="22"/>
+          <w:lang w:val="es-AR"/>
+        </w:rPr>
+        <w:t xml:space="preserve"> y abrir solo lo necesario (menos superficie de ataque), </w:t>
+      </w:r>
+      <w:r>
+        <w:rPr>
+          <w:rFonts w:ascii="Lexend" w:cs="Lexend" w:eastAsia="Lexend" w:hAnsi="Lexend"/>
+          <w:b/>
+          <w:bCs/>
+          <w:color w:val="1A1A1A"/>
+          <w:sz w:val="22"/>
+          <w:szCs w:val="22"/>
+          <w:lang w:val="es-AR"/>
+        </w:rPr>
+        <w:t xml:space="preserve">software actualizado</w:t>
+      </w:r>
+      <w:r>
+        <w:rPr>
+          <w:rFonts w:ascii="Lexend" w:cs="Lexend" w:eastAsia="Lexend" w:hAnsi="Lexend"/>
+          <w:color w:val="1A1A1A"/>
+          <w:sz w:val="22"/>
+          <w:szCs w:val="22"/>
+          <w:lang w:val="es-AR"/>
+        </w:rPr>
+        <w:t xml:space="preserve">, </w:t>
+      </w:r>
+      <w:r>
+        <w:rPr>
+          <w:rFonts w:ascii="Lexend" w:cs="Lexend" w:eastAsia="Lexend" w:hAnsi="Lexend"/>
+          <w:b/>
+          <w:bCs/>
+          <w:color w:val="1A1A1A"/>
+          <w:sz w:val="22"/>
+          <w:szCs w:val="22"/>
+          <w:lang w:val="es-AR"/>
+        </w:rPr>
+        <w:t xml:space="preserve">autenticación robusta</w:t>
+      </w:r>
+      <w:r>
+        <w:rPr>
+          <w:rFonts w:ascii="Lexend" w:cs="Lexend" w:eastAsia="Lexend" w:hAnsi="Lexend"/>
+          <w:color w:val="1A1A1A"/>
+          <w:sz w:val="22"/>
+          <w:szCs w:val="22"/>
+          <w:lang w:val="es-AR"/>
+        </w:rPr>
+        <w:t xml:space="preserve"> (claves SSH, certificados; cerrar Telnet), </w:t>
+      </w:r>
+      <w:r>
+        <w:rPr>
+          <w:rFonts w:ascii="Lexend" w:cs="Lexend" w:eastAsia="Lexend" w:hAnsi="Lexend"/>
+          <w:b/>
+          <w:bCs/>
+          <w:color w:val="1A1A1A"/>
+          <w:sz w:val="22"/>
+          <w:szCs w:val="22"/>
+          <w:lang w:val="es-AR"/>
+        </w:rPr>
+        <w:t xml:space="preserve">monitorear</w:t>
+      </w:r>
+      <w:r>
+        <w:rPr>
+          <w:rFonts w:ascii="Lexend" w:cs="Lexend" w:eastAsia="Lexend" w:hAnsi="Lexend"/>
+          <w:color w:val="1A1A1A"/>
+          <w:sz w:val="22"/>
+          <w:szCs w:val="22"/>
+          <w:lang w:val="es-AR"/>
+        </w:rPr>
+        <w:t xml:space="preserve"> los puertos en uso y sumar </w:t>
+      </w:r>
+      <w:r>
+        <w:rPr>
+          <w:rFonts w:ascii="Lexend" w:cs="Lexend" w:eastAsia="Lexend" w:hAnsi="Lexend"/>
+          <w:b/>
+          <w:bCs/>
+          <w:color w:val="1A1A1A"/>
+          <w:sz w:val="22"/>
+          <w:szCs w:val="22"/>
+          <w:lang w:val="es-AR"/>
+        </w:rPr>
+        <w:t xml:space="preserve">firewall + IDS/IPS</w:t>
+      </w:r>
+      <w:r>
+        <w:rPr>
+          <w:rFonts w:ascii="Lexend" w:cs="Lexend" w:eastAsia="Lexend" w:hAnsi="Lexend"/>
+          <w:color w:val="1A1A1A"/>
+          <w:sz w:val="22"/>
+          <w:szCs w:val="22"/>
+          <w:lang w:val="es-AR"/>
+        </w:rPr>
+        <w:t xml:space="preserve">.</w:t>
+      </w:r>
+    </w:p>
+    <w:p>
+      <w:pPr>
+        <w:spacing w:after="260" w:line="288"/>
+        <w:jc w:val="center"/>
+      </w:pPr>
+      <w:r>
+        <w:rPr>
+          <w:rFonts w:ascii="Lexend" w:cs="Lexend" w:eastAsia="Lexend" w:hAnsi="Lexend"/>
+          <w:b/>
+          <w:bCs/>
+          <w:color w:val="1A1A1A"/>
+          <w:sz w:val="22"/>
+          <w:szCs w:val="22"/>
+          <w:lang w:val="es-AR"/>
+        </w:rPr>
+        <w:t xml:space="preserve">25) ¿En qué consiste el ataque de predicción de secuencia TCP?</w:t>
+      </w:r>
+    </w:p>
+    <w:p>
+      <w:pPr>
+        <w:spacing w:after="120" w:line="280"/>
+        <w:jc w:val="both"/>
+      </w:pPr>
+      <w:r>
+        <w:rPr>
+          <w:rFonts w:ascii="Lexend" w:cs="Lexend" w:eastAsia="Lexend" w:hAnsi="Lexend"/>
+          <w:color w:val="1A1A1A"/>
+          <w:sz w:val="22"/>
+          <w:szCs w:val="22"/>
+          <w:lang w:val="es-AR"/>
+        </w:rPr>
+        <w:t xml:space="preserve">El atacante </w:t>
+      </w:r>
+      <w:r>
+        <w:rPr>
+          <w:rFonts w:ascii="Lexend" w:cs="Lexend" w:eastAsia="Lexend" w:hAnsi="Lexend"/>
+          <w:b/>
+          <w:bCs/>
+          <w:color w:val="1A1A1A"/>
+          <w:sz w:val="22"/>
+          <w:szCs w:val="22"/>
+          <w:lang w:val="es-AR"/>
+        </w:rPr>
+        <w:t xml:space="preserve">adivina el número de secuencia</w:t>
+      </w:r>
+      <w:r>
+        <w:rPr>
+          <w:rFonts w:ascii="Lexend" w:cs="Lexend" w:eastAsia="Lexend" w:hAnsi="Lexend"/>
+          <w:color w:val="1A1A1A"/>
+          <w:sz w:val="22"/>
+          <w:szCs w:val="22"/>
+          <w:lang w:val="es-AR"/>
+        </w:rPr>
+        <w:t xml:space="preserve"> de una conexión TCP y manda paquetes falsificados con ese número, haciéndose pasar por uno de los extremos. El destino los acepta como legítimos si llegan </w:t>
+      </w:r>
+      <w:r>
+        <w:rPr>
+          <w:rFonts w:ascii="Lexend" w:cs="Lexend" w:eastAsia="Lexend" w:hAnsi="Lexend"/>
+          <w:b/>
+          <w:bCs/>
+          <w:color w:val="1A1A1A"/>
+          <w:sz w:val="22"/>
+          <w:szCs w:val="22"/>
+          <w:lang w:val="es-AR"/>
+        </w:rPr>
+        <w:t xml:space="preserve">antes</w:t>
+      </w:r>
+      <w:r>
+        <w:rPr>
+          <w:rFonts w:ascii="Lexend" w:cs="Lexend" w:eastAsia="Lexend" w:hAnsi="Lexend"/>
+          <w:color w:val="1A1A1A"/>
+          <w:sz w:val="22"/>
+          <w:szCs w:val="22"/>
+          <w:lang w:val="es-AR"/>
+        </w:rPr>
+        <w:t xml:space="preserve"> que los del host verdadero. Se previene con números de secuencia iniciales </w:t>
+      </w:r>
+      <w:r>
+        <w:rPr>
+          <w:rFonts w:ascii="Lexend" w:cs="Lexend" w:eastAsia="Lexend" w:hAnsi="Lexend"/>
+          <w:b/>
+          <w:bCs/>
+          <w:color w:val="1A1A1A"/>
+          <w:sz w:val="22"/>
+          <w:szCs w:val="22"/>
+          <w:lang w:val="es-AR"/>
+        </w:rPr>
+        <w:t xml:space="preserve">aleatorios</w:t>
+      </w:r>
+      <w:r>
+        <w:rPr>
+          <w:rFonts w:ascii="Lexend" w:cs="Lexend" w:eastAsia="Lexend" w:hAnsi="Lexend"/>
+          <w:color w:val="1A1A1A"/>
+          <w:sz w:val="22"/>
+          <w:szCs w:val="22"/>
+          <w:lang w:val="es-AR"/>
+        </w:rPr>
+        <w:t xml:space="preserve"> (32 bits), que no se pueden predecir.</w:t>
+      </w:r>
+    </w:p>
+    <w:p>
+      <w:pPr>
+        <w:spacing w:after="260" w:line="288"/>
+        <w:jc w:val="center"/>
+      </w:pPr>
+      <w:r>
+        <w:rPr>
+          <w:rFonts w:ascii="Lexend" w:cs="Lexend" w:eastAsia="Lexend" w:hAnsi="Lexend"/>
+          <w:b/>
+          <w:bCs/>
+          <w:color w:val="1A1A1A"/>
+          <w:sz w:val="22"/>
+          <w:szCs w:val="22"/>
+          <w:lang w:val="es-AR"/>
+        </w:rPr>
+        <w:t xml:space="preserve">26) ¿Por qué hay que revisar también los puertos UDP abiertos? Dé ejemplos.</w:t>
+      </w:r>
+    </w:p>
+    <w:p>
+      <w:pPr>
+        <w:spacing w:after="120" w:line="280"/>
+        <w:jc w:val="both"/>
+      </w:pPr>
+      <w:r>
+        <w:rPr>
+          <w:rFonts w:ascii="Lexend" w:cs="Lexend" w:eastAsia="Lexend" w:hAnsi="Lexend"/>
+          <w:color w:val="1A1A1A"/>
+          <w:sz w:val="22"/>
+          <w:szCs w:val="22"/>
+          <w:lang w:val="es-AR"/>
+        </w:rPr>
+        <w:t xml:space="preserve">Porque servicios críticos usan UDP y también se atacan. </w:t>
+      </w:r>
+      <w:r>
+        <w:rPr>
+          <w:rFonts w:ascii="Lexend" w:cs="Lexend" w:eastAsia="Lexend" w:hAnsi="Lexend"/>
+          <w:b/>
+          <w:bCs/>
+          <w:color w:val="1A1A1A"/>
+          <w:sz w:val="22"/>
+          <w:szCs w:val="22"/>
+          <w:lang w:val="es-AR"/>
+        </w:rPr>
+        <w:t xml:space="preserve">DNS (53):</w:t>
+      </w:r>
+      <w:r>
+        <w:rPr>
+          <w:rFonts w:ascii="Lexend" w:cs="Lexend" w:eastAsia="Lexend" w:hAnsi="Lexend"/>
+          <w:color w:val="1A1A1A"/>
+          <w:sz w:val="22"/>
+          <w:szCs w:val="22"/>
+          <w:lang w:val="es-AR"/>
+        </w:rPr>
+        <w:t xml:space="preserve"> se bloquea si no hay servidor y, si lo hay, se limitan las peticiones (por ejemplo, con Fail2ban). </w:t>
+      </w:r>
+      <w:r>
+        <w:rPr>
+          <w:rFonts w:ascii="Lexend" w:cs="Lexend" w:eastAsia="Lexend" w:hAnsi="Lexend"/>
+          <w:b/>
+          <w:bCs/>
+          <w:color w:val="1A1A1A"/>
+          <w:sz w:val="22"/>
+          <w:szCs w:val="22"/>
+          <w:lang w:val="es-AR"/>
+        </w:rPr>
+        <w:t xml:space="preserve">DHCP (67/68):</w:t>
+      </w:r>
+      <w:r>
+        <w:rPr>
+          <w:rFonts w:ascii="Lexend" w:cs="Lexend" w:eastAsia="Lexend" w:hAnsi="Lexend"/>
+          <w:color w:val="1A1A1A"/>
+          <w:sz w:val="22"/>
+          <w:szCs w:val="22"/>
+          <w:lang w:val="es-AR"/>
+        </w:rPr>
+        <w:t xml:space="preserve"> se puede saturar con </w:t>
+      </w:r>
+      <w:r>
+        <w:rPr>
+          <w:rFonts w:ascii="Lexend" w:cs="Lexend" w:eastAsia="Lexend" w:hAnsi="Lexend"/>
+          <w:i/>
+          <w:iCs/>
+          <w:color w:val="1A1A1A"/>
+          <w:sz w:val="22"/>
+          <w:szCs w:val="22"/>
+          <w:lang w:val="es-AR"/>
+        </w:rPr>
+        <w:t xml:space="preserve">DHCP Discover</w:t>
+      </w:r>
+      <w:r>
+        <w:rPr>
+          <w:rFonts w:ascii="Lexend" w:cs="Lexend" w:eastAsia="Lexend" w:hAnsi="Lexend"/>
+          <w:color w:val="1A1A1A"/>
+          <w:sz w:val="22"/>
+          <w:szCs w:val="22"/>
+          <w:lang w:val="es-AR"/>
+        </w:rPr>
+        <w:t xml:space="preserve">; si no se usa, se deshabilita. </w:t>
+      </w:r>
+      <w:r>
+        <w:rPr>
+          <w:rFonts w:ascii="Lexend" w:cs="Lexend" w:eastAsia="Lexend" w:hAnsi="Lexend"/>
+          <w:b/>
+          <w:bCs/>
+          <w:color w:val="1A1A1A"/>
+          <w:sz w:val="22"/>
+          <w:szCs w:val="22"/>
+          <w:lang w:val="es-AR"/>
+        </w:rPr>
+        <w:t xml:space="preserve">SNMP (161/162):</w:t>
+      </w:r>
+      <w:r>
+        <w:rPr>
+          <w:rFonts w:ascii="Lexend" w:cs="Lexend" w:eastAsia="Lexend" w:hAnsi="Lexend"/>
+          <w:color w:val="1A1A1A"/>
+          <w:sz w:val="22"/>
+          <w:szCs w:val="22"/>
+          <w:lang w:val="es-AR"/>
+        </w:rPr>
+        <w:t xml:space="preserve"> la v2c viaja en texto claro; conviene la </w:t>
+      </w:r>
+      <w:r>
+        <w:rPr>
+          <w:rFonts w:ascii="Lexend" w:cs="Lexend" w:eastAsia="Lexend" w:hAnsi="Lexend"/>
+          <w:b/>
+          <w:bCs/>
+          <w:color w:val="1A1A1A"/>
+          <w:sz w:val="22"/>
+          <w:szCs w:val="22"/>
+          <w:lang w:val="es-AR"/>
+        </w:rPr>
+        <w:t xml:space="preserve">v3</w:t>
+      </w:r>
+      <w:r>
+        <w:rPr>
+          <w:rFonts w:ascii="Lexend" w:cs="Lexend" w:eastAsia="Lexend" w:hAnsi="Lexend"/>
+          <w:color w:val="1A1A1A"/>
+          <w:sz w:val="22"/>
+          <w:szCs w:val="22"/>
+          <w:lang w:val="es-AR"/>
+        </w:rPr>
+        <w:t xml:space="preserve"> (autenticación y cifrado) o bloquearlo. Además, como UDP no tiene conexión, </w:t>
+      </w:r>
+      <w:r>
+        <w:rPr>
+          <w:rFonts w:ascii="Lexend" w:cs="Lexend" w:eastAsia="Lexend" w:hAnsi="Lexend"/>
+          <w:b/>
+          <w:bCs/>
+          <w:color w:val="1A1A1A"/>
+          <w:sz w:val="22"/>
+          <w:szCs w:val="22"/>
+          <w:lang w:val="es-AR"/>
+        </w:rPr>
+        <w:t xml:space="preserve">falsificar la IP de origen es fácil</w:t>
+      </w:r>
+      <w:r>
+        <w:rPr>
+          <w:rFonts w:ascii="Lexend" w:cs="Lexend" w:eastAsia="Lexend" w:hAnsi="Lexend"/>
+          <w:color w:val="1A1A1A"/>
+          <w:sz w:val="22"/>
+          <w:szCs w:val="22"/>
+          <w:lang w:val="es-AR"/>
+        </w:rPr>
+        <w:t xml:space="preserve">, así que filtrar por IP no alcanza.</w:t>
+      </w:r>
+    </w:p>
+    <w:p>
+      <w:pPr>
+        <w:spacing w:after="260" w:line="288"/>
+        <w:jc w:val="center"/>
+      </w:pPr>
+      <w:r>
+        <w:rPr>
+          <w:rFonts w:ascii="Lexend" w:cs="Lexend" w:eastAsia="Lexend" w:hAnsi="Lexend"/>
+          <w:b/>
+          <w:bCs/>
+          <w:color w:val="1A1A1A"/>
+          <w:sz w:val="22"/>
+          <w:szCs w:val="22"/>
+          <w:lang w:val="es-AR"/>
+        </w:rPr>
+        <w:t xml:space="preserve">27) ¿Por qué no alcanza un firewall stateful y qué capas inspecciona cada tipo de firewall?</w:t>
+      </w:r>
+    </w:p>
+    <w:p>
+      <w:pPr>
+        <w:spacing w:after="120" w:line="280"/>
+        <w:jc w:val="both"/>
+      </w:pPr>
+      <w:r>
+        <w:rPr>
+          <w:rFonts w:ascii="Lexend" w:cs="Lexend" w:eastAsia="Lexend" w:hAnsi="Lexend"/>
+          <w:color w:val="1A1A1A"/>
+          <w:sz w:val="22"/>
+          <w:szCs w:val="22"/>
+          <w:lang w:val="es-AR"/>
+        </w:rPr>
+        <w:t xml:space="preserve">El </w:t>
+      </w:r>
+      <w:r>
+        <w:rPr>
+          <w:rFonts w:ascii="Lexend" w:cs="Lexend" w:eastAsia="Lexend" w:hAnsi="Lexend"/>
+          <w:i/>
+          <w:iCs/>
+          <w:color w:val="1A1A1A"/>
+          <w:sz w:val="22"/>
+          <w:szCs w:val="22"/>
+          <w:lang w:val="es-AR"/>
+        </w:rPr>
+        <w:t xml:space="preserve">stateful</w:t>
+      </w:r>
+      <w:r>
+        <w:rPr>
+          <w:rFonts w:ascii="Lexend" w:cs="Lexend" w:eastAsia="Lexend" w:hAnsi="Lexend"/>
+          <w:color w:val="1A1A1A"/>
+          <w:sz w:val="22"/>
+          <w:szCs w:val="22"/>
+          <w:lang w:val="es-AR"/>
+        </w:rPr>
+        <w:t xml:space="preserve"> decide por IP, puerto y estado de la conexión, pero hoy muchas aplicaciones van por el mismo puerto (443), así que </w:t>
+      </w:r>
+      <w:r>
+        <w:rPr>
+          <w:rFonts w:ascii="Lexend" w:cs="Lexend" w:eastAsia="Lexend" w:hAnsi="Lexend"/>
+          <w:b/>
+          <w:bCs/>
+          <w:color w:val="1A1A1A"/>
+          <w:sz w:val="22"/>
+          <w:szCs w:val="22"/>
+          <w:lang w:val="es-AR"/>
+        </w:rPr>
+        <w:t xml:space="preserve">no puede distinguirlas</w:t>
+      </w:r>
+      <w:r>
+        <w:rPr>
+          <w:rFonts w:ascii="Lexend" w:cs="Lexend" w:eastAsia="Lexend" w:hAnsi="Lexend"/>
+          <w:color w:val="1A1A1A"/>
+          <w:sz w:val="22"/>
+          <w:szCs w:val="22"/>
+          <w:lang w:val="es-AR"/>
+        </w:rPr>
+        <w:t xml:space="preserve">. El </w:t>
+      </w:r>
+      <w:r>
+        <w:rPr>
+          <w:rFonts w:ascii="Lexend" w:cs="Lexend" w:eastAsia="Lexend" w:hAnsi="Lexend"/>
+          <w:b/>
+          <w:bCs/>
+          <w:color w:val="1A1A1A"/>
+          <w:sz w:val="22"/>
+          <w:szCs w:val="22"/>
+          <w:lang w:val="es-AR"/>
+        </w:rPr>
+        <w:t xml:space="preserve">NGFW</w:t>
+      </w:r>
+      <w:r>
+        <w:rPr>
+          <w:rFonts w:ascii="Lexend" w:cs="Lexend" w:eastAsia="Lexend" w:hAnsi="Lexend"/>
+          <w:color w:val="1A1A1A"/>
+          <w:sz w:val="22"/>
+          <w:szCs w:val="22"/>
+          <w:lang w:val="es-AR"/>
+        </w:rPr>
+        <w:t xml:space="preserve"> reconoce la aplicación sin importar el puerto y suma IPS. Por capas: </w:t>
+      </w:r>
+      <w:r>
+        <w:rPr>
+          <w:rFonts w:ascii="Lexend" w:cs="Lexend" w:eastAsia="Lexend" w:hAnsi="Lexend"/>
+          <w:b/>
+          <w:bCs/>
+          <w:color w:val="1A1A1A"/>
+          <w:sz w:val="22"/>
+          <w:szCs w:val="22"/>
+          <w:lang w:val="es-AR"/>
+        </w:rPr>
+        <w:t xml:space="preserve">stateless y stateful, capas 3–4</w:t>
+      </w:r>
+      <w:r>
+        <w:rPr>
+          <w:rFonts w:ascii="Lexend" w:cs="Lexend" w:eastAsia="Lexend" w:hAnsi="Lexend"/>
+          <w:color w:val="1A1A1A"/>
+          <w:sz w:val="22"/>
+          <w:szCs w:val="22"/>
+          <w:lang w:val="es-AR"/>
+        </w:rPr>
+        <w:t xml:space="preserve">; </w:t>
+      </w:r>
+      <w:r>
+        <w:rPr>
+          <w:rFonts w:ascii="Lexend" w:cs="Lexend" w:eastAsia="Lexend" w:hAnsi="Lexend"/>
+          <w:b/>
+          <w:bCs/>
+          <w:color w:val="1A1A1A"/>
+          <w:sz w:val="22"/>
+          <w:szCs w:val="22"/>
+          <w:lang w:val="es-AR"/>
+        </w:rPr>
+        <w:t xml:space="preserve">proxy, capa 7</w:t>
+      </w:r>
+      <w:r>
+        <w:rPr>
+          <w:rFonts w:ascii="Lexend" w:cs="Lexend" w:eastAsia="Lexend" w:hAnsi="Lexend"/>
+          <w:color w:val="1A1A1A"/>
+          <w:sz w:val="22"/>
+          <w:szCs w:val="22"/>
+          <w:lang w:val="es-AR"/>
+        </w:rPr>
+        <w:t xml:space="preserve">; </w:t>
+      </w:r>
+      <w:r>
+        <w:rPr>
+          <w:rFonts w:ascii="Lexend" w:cs="Lexend" w:eastAsia="Lexend" w:hAnsi="Lexend"/>
+          <w:b/>
+          <w:bCs/>
+          <w:color w:val="1A1A1A"/>
+          <w:sz w:val="22"/>
+          <w:szCs w:val="22"/>
+          <w:lang w:val="es-AR"/>
+        </w:rPr>
+        <w:t xml:space="preserve">NGFW, de la 3 a la 7</w:t>
+      </w:r>
+      <w:r>
+        <w:rPr>
+          <w:rFonts w:ascii="Lexend" w:cs="Lexend" w:eastAsia="Lexend" w:hAnsi="Lexend"/>
+          <w:color w:val="1A1A1A"/>
+          <w:sz w:val="22"/>
+          <w:szCs w:val="22"/>
+          <w:lang w:val="es-AR"/>
+        </w:rPr>
+        <w:t xml:space="preserve">.</w:t>
+      </w:r>
+    </w:p>
+    <w:p>
+      <w:pPr>
         <w:pStyle w:val="Heading1"/>
         <w:keepNext/>
         <w:spacing w:after="220" w:before="380"/>
@@ -16395,6 +18350,155 @@
           <w:lang w:val="es-AR"/>
         </w:rPr>
         <w:t xml:space="preserve">.</w:t>
+      </w:r>
+    </w:p>
+    <w:p>
+      <w:pPr>
+        <w:pStyle w:val="ListParagraph"/>
+        <w:numPr>
+          <w:ilvl w:val="0"/>
+          <w:numId w:val="1"/>
+        </w:numPr>
+        <w:spacing w:after="100" w:line="276"/>
+        <w:jc w:val="both"/>
+      </w:pPr>
+      <w:r>
+        <w:rPr>
+          <w:rFonts w:ascii="Lexend" w:cs="Lexend" w:eastAsia="Lexend" w:hAnsi="Lexend"/>
+          <w:color w:val="1A1A1A"/>
+          <w:sz w:val="22"/>
+          <w:szCs w:val="22"/>
+          <w:lang w:val="es-AR"/>
+        </w:rPr>
+        <w:t xml:space="preserve">Puertos más atacados: </w:t>
+      </w:r>
+      <w:r>
+        <w:rPr>
+          <w:rFonts w:ascii="Lexend" w:cs="Lexend" w:eastAsia="Lexend" w:hAnsi="Lexend"/>
+          <w:b/>
+          <w:bCs/>
+          <w:color w:val="1A1A1A"/>
+          <w:sz w:val="22"/>
+          <w:szCs w:val="22"/>
+          <w:lang w:val="es-AR"/>
+        </w:rPr>
+        <w:t xml:space="preserve">21, 22, 23, 25, 80, 443, 110</w:t>
+      </w:r>
+      <w:r>
+        <w:rPr>
+          <w:rFonts w:ascii="Lexend" w:cs="Lexend" w:eastAsia="Lexend" w:hAnsi="Lexend"/>
+          <w:color w:val="1A1A1A"/>
+          <w:sz w:val="22"/>
+          <w:szCs w:val="22"/>
+          <w:lang w:val="es-AR"/>
+        </w:rPr>
+        <w:t xml:space="preserve">. </w:t>
+      </w:r>
+      <w:r>
+        <w:rPr>
+          <w:rFonts w:ascii="Lexend" w:cs="Lexend" w:eastAsia="Lexend" w:hAnsi="Lexend"/>
+          <w:b/>
+          <w:bCs/>
+          <w:color w:val="1A1A1A"/>
+          <w:sz w:val="22"/>
+          <w:szCs w:val="22"/>
+          <w:lang w:val="es-AR"/>
+        </w:rPr>
+        <w:t xml:space="preserve">SNMPv2c</w:t>
+      </w:r>
+      <w:r>
+        <w:rPr>
+          <w:rFonts w:ascii="Lexend" w:cs="Lexend" w:eastAsia="Lexend" w:hAnsi="Lexend"/>
+          <w:color w:val="1A1A1A"/>
+          <w:sz w:val="22"/>
+          <w:szCs w:val="22"/>
+          <w:lang w:val="es-AR"/>
+        </w:rPr>
+        <w:t xml:space="preserve"> en texto claro, </w:t>
+      </w:r>
+      <w:r>
+        <w:rPr>
+          <w:rFonts w:ascii="Lexend" w:cs="Lexend" w:eastAsia="Lexend" w:hAnsi="Lexend"/>
+          <w:b/>
+          <w:bCs/>
+          <w:color w:val="1A1A1A"/>
+          <w:sz w:val="22"/>
+          <w:szCs w:val="22"/>
+          <w:lang w:val="es-AR"/>
+        </w:rPr>
+        <w:t xml:space="preserve">SNMPv3</w:t>
+      </w:r>
+      <w:r>
+        <w:rPr>
+          <w:rFonts w:ascii="Lexend" w:cs="Lexend" w:eastAsia="Lexend" w:hAnsi="Lexend"/>
+          <w:color w:val="1A1A1A"/>
+          <w:sz w:val="22"/>
+          <w:szCs w:val="22"/>
+          <w:lang w:val="es-AR"/>
+        </w:rPr>
+        <w:t xml:space="preserve"> cifrado. </w:t>
+      </w:r>
+      <w:r>
+        <w:rPr>
+          <w:rFonts w:ascii="Lexend" w:cs="Lexend" w:eastAsia="Lexend" w:hAnsi="Lexend"/>
+          <w:b/>
+          <w:bCs/>
+          <w:color w:val="1A1A1A"/>
+          <w:sz w:val="22"/>
+          <w:szCs w:val="22"/>
+          <w:lang w:val="es-AR"/>
+        </w:rPr>
+        <w:t xml:space="preserve">Nmap</w:t>
+      </w:r>
+      <w:r>
+        <w:rPr>
+          <w:rFonts w:ascii="Lexend" w:cs="Lexend" w:eastAsia="Lexend" w:hAnsi="Lexend"/>
+          <w:color w:val="1A1A1A"/>
+          <w:sz w:val="22"/>
+          <w:szCs w:val="22"/>
+          <w:lang w:val="es-AR"/>
+        </w:rPr>
+        <w:t xml:space="preserve"> </w:t>
+      </w:r>
+      <w:r>
+        <w:rPr>
+          <w:rFonts w:ascii="Consolas" w:cs="Consolas" w:eastAsia="Consolas" w:hAnsi="Consolas"/>
+          <w:color w:val="1A1A1A"/>
+          <w:sz w:val="20"/>
+          <w:szCs w:val="20"/>
+          <w:lang w:val="es-AR"/>
+        </w:rPr>
+        <w:t xml:space="preserve">-sU</w:t>
+      </w:r>
+      <w:r>
+        <w:rPr>
+          <w:rFonts w:ascii="Lexend" w:cs="Lexend" w:eastAsia="Lexend" w:hAnsi="Lexend"/>
+          <w:color w:val="1A1A1A"/>
+          <w:sz w:val="22"/>
+          <w:szCs w:val="22"/>
+          <w:lang w:val="es-AR"/>
+        </w:rPr>
+        <w:t xml:space="preserve"> (UDP) / </w:t>
+      </w:r>
+      <w:r>
+        <w:rPr>
+          <w:rFonts w:ascii="Consolas" w:cs="Consolas" w:eastAsia="Consolas" w:hAnsi="Consolas"/>
+          <w:color w:val="1A1A1A"/>
+          <w:sz w:val="20"/>
+          <w:szCs w:val="20"/>
+          <w:lang w:val="es-AR"/>
+        </w:rPr>
+        <w:t xml:space="preserve">-sS</w:t>
+      </w:r>
+      <w:r>
+        <w:rPr>
+          <w:rFonts w:ascii="Lexend" w:cs="Lexend" w:eastAsia="Lexend" w:hAnsi="Lexend"/>
+          <w:color w:val="1A1A1A"/>
+          <w:sz w:val="22"/>
+          <w:szCs w:val="22"/>
+          <w:lang w:val="es-AR"/>
+        </w:rPr>
+        <w:t xml:space="preserve"> (TCP).</w:t>
       </w:r>
     </w:p>
     <w:p>

</xml_diff>